<commit_message>
feat(render): auto-seed editor user alongside owner
</commit_message>
<xml_diff>
--- a/docs/email-notification-setup-ru.docx
+++ b/docs/email-notification-setup-ru.docx
@@ -4,332 +4,64 @@
   <w:body>
     <w:p>
       <w:pPr>
-        <w:spacing w:before="0" w:after="40"/>
-        <w:jc w:val="center"/>
+        <w:pStyle w:val="Heading1"/>
       </w:pPr>
       <w:r>
-        <w:rPr>
-          <w:rFonts w:ascii="Calibri" w:hAnsi="Calibri"/>
-          <w:b/>
-          <w:color w:val="2563EB"/>
-          <w:sz w:val="20"/>
-        </w:rPr>
-        <w:t>MIRACON CONSTRUCTIONS • ТЕХНИЧЕСКАЯ ДОКУМЕНТАЦИЯ</w:t>
-        <w:br/>
+        <w:t>Настройка почты и автоответа для заявок MIRACON</w:t>
       </w:r>
+    </w:p>
+    <w:p>
       <w:r>
-        <w:rPr>
-          <w:rFonts w:ascii="Calibri" w:hAnsi="Calibri"/>
-          <w:b/>
-          <w:color w:val="0F172A"/>
-          <w:sz w:val="36"/>
-        </w:rPr>
-        <w:t>Руководство по настройке email-уведомлений о заявках с сайта (SMTP)</w:t>
+        <w:t>Сайт сохраняет принятую заявку и задания отправки в PostgreSQL одной транзакцией. HTTP 201 означает сохранение, не доставку письма. Почта отправляется отдельным Cron-процессом; без SMTP и расписания заявки остаются доступными администратору, но письма не поступают. Для уже сохранённых заявок до установки миграции задания задним числом не создаются.</w:t>
+      </w:r>
+    </w:p>
+    <w:p>
+      <w:r>
+        <w:t>Перед включением отправки: сделайте резервную копию, примените npm run postgres:migrate (включая 0020_contact_mail_outbox.sql), настройте защищённые серверные переменные и Cron, затем проверьте два контролируемых адреса для уведомления и автоответа. Не отправляйте пробные письма посетителям.</w:t>
+      </w:r>
+    </w:p>
+    <w:p>
+      <w:r>
+        <w:t>Безопасность действующего сайта: SMTP-пароль и CONTACT_DIGEST_SECRET обнаружены в публичной .htaccess. Оператор cPanel должен сначала задать текущие значения в защищённом окружении, проверить приоритет переменных, затем удалить только строки с секретами из .htaccess, сохранив маршрутизацию Passenger, перезапустить приложение и проверить форму и Cron. После этого сменить оба секрета в защищённом окружении и снова проверить работу. HTTP 403 на .htaccess не доказывает безопасность. FTP к public_html не позволяет создать защищённое окружение; не удаляйте действующие значения вслепую.</w:t>
       </w:r>
     </w:p>
     <w:p>
       <w:pPr>
-        <w:spacing w:before="40" w:after="320"/>
-        <w:jc w:val="center"/>
+        <w:pStyle w:val="Heading2"/>
       </w:pPr>
       <w:r>
-        <w:rPr>
-          <w:rFonts w:ascii="Calibri" w:hAnsi="Calibri"/>
-          <w:color w:val="64748B"/>
-          <w:sz w:val="20"/>
-        </w:rPr>
-        <w:t>Инструкция по подключению почтового сервера для формы обратной связи сайта miracon.gr</w:t>
-        <w:br/>
-        <w:t>Дата: Сентябрь 2026 г. | Версия: 1.0</w:t>
-      </w:r>
-    </w:p>
-    <w:p>
-      <w:pPr>
-        <w:spacing w:after="240"/>
-      </w:pPr>
-      <w:r>
-        <w:rPr>
-          <w:color w:val="CBD5E1"/>
-        </w:rPr>
-        <w:t>——————————————————————————————————————————————————————————</w:t>
-      </w:r>
-    </w:p>
-    <w:p>
-      <w:pPr>
-        <w:pStyle w:val="Heading1"/>
-        <w:spacing w:before="240" w:after="120"/>
-      </w:pPr>
-      <w:r>
-        <w:t>1. Причина отсутствия писем на текущий момент</w:t>
-      </w:r>
-    </w:p>
-    <w:p>
-      <w:r>
-        <w:t xml:space="preserve">Форма обратной связи на сайте </w:t>
-      </w:r>
-      <w:r>
-        <w:rPr>
-          <w:b/>
-        </w:rPr>
-        <w:t>технически полностью исправна и функционирует</w:t>
-      </w:r>
-      <w:r>
-        <w:t>:</w:t>
-      </w:r>
-    </w:p>
-    <w:p>
-      <w:pPr>
-        <w:pStyle w:val="ListBullet"/>
-      </w:pPr>
-      <w:r>
-        <w:t xml:space="preserve">Когда посетитель сайта отправляет заявку, она проходит криптографическую защиту от спама (HMAC challenge) и </w:t>
-      </w:r>
-      <w:r>
-        <w:rPr>
-          <w:b/>
-        </w:rPr>
-        <w:t>гарантированно сохраняется в базу данных PostgreSQL</w:t>
-      </w:r>
-      <w:r>
-        <w:rPr>
-          <w:rFonts w:ascii="Calibri" w:hAnsi="Calibri"/>
-        </w:rPr>
-        <w:t xml:space="preserve"> (в таблицу </w:t>
-      </w:r>
-      <w:r>
-        <w:rPr>
-          <w:rFonts w:ascii="Consolas" w:hAnsi="Consolas"/>
-        </w:rPr>
-        <w:t>miracon.contacts</w:t>
-      </w:r>
-      <w:r>
-        <w:rPr>
-          <w:rFonts w:ascii="Calibri" w:hAnsi="Calibri"/>
-        </w:rPr>
-        <w:t>).</w:t>
-      </w:r>
-    </w:p>
-    <w:p>
-      <w:pPr>
-        <w:pStyle w:val="ListBullet"/>
-      </w:pPr>
-      <w:r>
-        <w:t xml:space="preserve">Однако модуль отправки email-уведомлений по умолчанию </w:t>
-      </w:r>
-      <w:r>
-        <w:rPr>
-          <w:b/>
-        </w:rPr>
-        <w:t>отключен в конфигурации</w:t>
-      </w:r>
-      <w:r>
-        <w:t xml:space="preserve"> (параметр </w:t>
-      </w:r>
-      <w:r>
-        <w:rPr>
-          <w:rFonts w:ascii="Consolas" w:hAnsi="Consolas"/>
-        </w:rPr>
-        <w:t>CONTACT_SMTP_ENABLED=false</w:t>
-      </w:r>
-      <w:r>
-        <w:t>). Приложению на сервере еще не были переданы реквизиты почтового сервера (логин, пароль, сервер отправки).</w:t>
-      </w:r>
-    </w:p>
-    <w:p>
-      <w:pPr>
-        <w:pStyle w:val="ListBullet"/>
-      </w:pPr>
-      <w:r>
-        <w:t>В результате: заявка сохраняется в базу данных, пользователь видит подтверждение об успешной отправке, но уведомление на email администратора не уходит, так как сайту физически не указан почтовый ящик-отправитель.</w:t>
+        <w:t>1. Переменные окружения</w:t>
       </w:r>
     </w:p>
     <w:tbl>
       <w:tblPr>
+        <w:tblStyle w:val="LightShading-Accent1"/>
         <w:tblW w:type="auto" w:w="0"/>
         <w:jc w:val="center"/>
-        <w:tblLayout w:type="fixed"/>
         <w:tblLook w:firstColumn="1" w:firstRow="1" w:lastColumn="0" w:lastRow="0" w:noHBand="0" w:noVBand="1" w:val="04A0"/>
       </w:tblPr>
       <w:tblGrid>
-        <w:gridCol w:w="9360"/>
+        <w:gridCol w:w="4320"/>
+        <w:gridCol w:w="4320"/>
       </w:tblGrid>
       <w:tr>
         <w:tc>
           <w:tcPr>
-            <w:tcW w:type="dxa" w:w="9792"/>
-            <w:shd w:fill="ECFDF5"/>
-            <w:tcMar>
-              <w:top w:w="160" w:type="dxa"/>
-              <w:bottom w:w="160" w:type="dxa"/>
-              <w:left w:w="240" w:type="dxa"/>
-              <w:right w:w="200" w:type="dxa"/>
-            </w:tcMar>
-            <w:tcBorders>
-              <w:top w:val="none" w:sz="4" w:space="0" w:color="auto"/>
-              <w:left w:val="single" w:sz="24" w:space="0" w:color="059669"/>
-              <w:bottom w:val="none" w:sz="4" w:space="0" w:color="auto"/>
-              <w:right w:val="none" w:sz="4" w:space="0" w:color="auto"/>
-              <w:insideH w:val="none"/>
-              <w:insideV w:val="none"/>
-            </w:tcBorders>
-          </w:tcPr>
-          <w:p>
-            <w:pPr>
-              <w:spacing w:before="40" w:after="80"/>
-            </w:pPr>
-            <w:r>
-              <w:rPr>
-                <w:rFonts w:ascii="Calibri" w:hAnsi="Calibri"/>
-                <w:b/>
-                <w:color w:val="1E40AF"/>
-                <w:sz w:val="21"/>
-              </w:rPr>
-              <w:t>📌 ВАЖНО: ЗАЯВКИ НЕ ПОТЕРЯЛИСЬ</w:t>
-              <w:br/>
-            </w:r>
-            <w:r>
-              <w:rPr>
-                <w:rFonts w:ascii="Calibri" w:hAnsi="Calibri"/>
-                <w:color w:val="1E293B"/>
-                <w:sz w:val="20"/>
-              </w:rPr>
-              <w:t>Все заявки, отправленные посетителями сайта ранее, не потерялись! Они надежно сохранены в базе данных PostgreSQL. В Разделе 7 этой инструкции описано, как их быстро просмотреть и выгрузить.</w:t>
-            </w:r>
-          </w:p>
-        </w:tc>
-      </w:tr>
-    </w:tbl>
-    <w:p>
-      <w:pPr>
-        <w:spacing w:before="40" w:after="80"/>
-      </w:pPr>
-    </w:p>
-    <w:p>
-      <w:pPr>
-        <w:pStyle w:val="Heading1"/>
-        <w:spacing w:before="280" w:after="120"/>
-      </w:pPr>
-      <w:r>
-        <w:t>2. Перечень необходимых параметров (Environment Variables)</w:t>
-      </w:r>
-    </w:p>
-    <w:p>
-      <w:r>
-        <w:t xml:space="preserve">Для активации отправки писем в настройках сервера (в блоке </w:t>
-      </w:r>
-      <w:r>
-        <w:rPr>
-          <w:b/>
-        </w:rPr>
-        <w:t>Environment Variables</w:t>
-      </w:r>
-      <w:r>
-        <w:t>) необходимо задать следующие параметры:</w:t>
-      </w:r>
-    </w:p>
-    <w:tbl>
-      <w:tblPr>
-        <w:tblW w:type="auto" w:w="0"/>
-        <w:jc w:val="center"/>
-        <w:tblLayout w:type="fixed"/>
-        <w:tblLook w:firstColumn="1" w:firstRow="1" w:lastColumn="0" w:lastRow="0" w:noHBand="0" w:noVBand="1" w:val="04A0"/>
-      </w:tblPr>
-      <w:tblGrid>
-        <w:gridCol w:w="2592"/>
-        <w:gridCol w:w="1440"/>
-        <w:gridCol w:w="3168"/>
-        <w:gridCol w:w="2160"/>
-      </w:tblGrid>
-      <w:tr>
-        <w:tc>
-          <w:tcPr>
-            <w:tcW w:type="dxa" w:w="2448"/>
-            <w:shd w:fill="2563EB"/>
-            <w:tcMar>
-              <w:top w:w="120" w:type="dxa"/>
-              <w:bottom w:w="120" w:type="dxa"/>
-              <w:left w:w="140" w:type="dxa"/>
-              <w:right w:w="140" w:type="dxa"/>
-            </w:tcMar>
+            <w:tcW w:type="dxa" w:w="4320"/>
           </w:tcPr>
           <w:p>
             <w:r>
-              <w:rPr>
-                <w:rFonts w:ascii="Calibri" w:hAnsi="Calibri"/>
-                <w:b/>
-                <w:color w:val="FFFFFF"/>
-                <w:sz w:val="20"/>
-              </w:rPr>
-              <w:t>Параметр</w:t>
+              <w:t>Переменная</w:t>
             </w:r>
           </w:p>
         </w:tc>
         <w:tc>
           <w:tcPr>
-            <w:tcW w:type="dxa" w:w="2448"/>
-            <w:shd w:fill="2563EB"/>
-            <w:tcMar>
-              <w:top w:w="120" w:type="dxa"/>
-              <w:bottom w:w="120" w:type="dxa"/>
-              <w:left w:w="140" w:type="dxa"/>
-              <w:right w:w="140" w:type="dxa"/>
-            </w:tcMar>
+            <w:tcW w:type="dxa" w:w="4320"/>
           </w:tcPr>
           <w:p>
             <w:r>
-              <w:rPr>
-                <w:rFonts w:ascii="Calibri" w:hAnsi="Calibri"/>
-                <w:b/>
-                <w:color w:val="FFFFFF"/>
-                <w:sz w:val="20"/>
-              </w:rPr>
-              <w:t>Значения</w:t>
-            </w:r>
-          </w:p>
-        </w:tc>
-        <w:tc>
-          <w:tcPr>
-            <w:tcW w:type="dxa" w:w="2448"/>
-            <w:shd w:fill="2563EB"/>
-            <w:tcMar>
-              <w:top w:w="120" w:type="dxa"/>
-              <w:bottom w:w="120" w:type="dxa"/>
-              <w:left w:w="140" w:type="dxa"/>
-              <w:right w:w="140" w:type="dxa"/>
-            </w:tcMar>
-          </w:tcPr>
-          <w:p>
-            <w:r>
-              <w:rPr>
-                <w:rFonts w:ascii="Calibri" w:hAnsi="Calibri"/>
-                <w:b/>
-                <w:color w:val="FFFFFF"/>
-                <w:sz w:val="20"/>
-              </w:rPr>
-              <w:t>Назначение</w:t>
-            </w:r>
-          </w:p>
-        </w:tc>
-        <w:tc>
-          <w:tcPr>
-            <w:tcW w:type="dxa" w:w="2448"/>
-            <w:shd w:fill="2563EB"/>
-            <w:tcMar>
-              <w:top w:w="120" w:type="dxa"/>
-              <w:bottom w:w="120" w:type="dxa"/>
-              <w:left w:w="140" w:type="dxa"/>
-              <w:right w:w="140" w:type="dxa"/>
-            </w:tcMar>
-          </w:tcPr>
-          <w:p>
-            <w:r>
-              <w:rPr>
-                <w:rFonts w:ascii="Calibri" w:hAnsi="Calibri"/>
-                <w:b/>
-                <w:color w:val="FFFFFF"/>
-                <w:sz w:val="20"/>
-              </w:rPr>
-              <w:t>Пример</w:t>
+              <w:t>Требование</w:t>
             </w:r>
           </w:p>
         </w:tc>
@@ -337,121 +69,21 @@
       <w:tr>
         <w:tc>
           <w:tcPr>
-            <w:tcW w:type="dxa" w:w="2592"/>
-            <w:shd w:fill="FFFFFF"/>
-            <w:tcMar>
-              <w:top w:w="100" w:type="dxa"/>
-              <w:bottom w:w="100" w:type="dxa"/>
-              <w:left w:w="120" w:type="dxa"/>
-              <w:right w:w="120" w:type="dxa"/>
-            </w:tcMar>
-            <w:tcBorders>
-              <w:top w:val="none" w:sz="4" w:space="0" w:color="auto"/>
-              <w:left w:val="none" w:sz="4" w:space="0" w:color="auto"/>
-              <w:bottom w:val="single" w:sz="4" w:space="0" w:color="E2E8F0"/>
-              <w:right w:val="none" w:sz="4" w:space="0" w:color="auto"/>
-              <w:insideH w:val="none"/>
-              <w:insideV w:val="none"/>
-            </w:tcBorders>
+            <w:tcW w:type="dxa" w:w="4320"/>
           </w:tcPr>
           <w:p>
             <w:r>
-              <w:rPr>
-                <w:rFonts w:ascii="Consolas" w:hAnsi="Consolas"/>
-                <w:color w:val="0F172A"/>
-                <w:sz w:val="19"/>
-              </w:rPr>
               <w:t>CONTACT_SMTP_ENABLED</w:t>
             </w:r>
           </w:p>
         </w:tc>
         <w:tc>
           <w:tcPr>
-            <w:tcW w:type="dxa" w:w="1440"/>
-            <w:shd w:fill="FFFFFF"/>
-            <w:tcMar>
-              <w:top w:w="100" w:type="dxa"/>
-              <w:bottom w:w="100" w:type="dxa"/>
-              <w:left w:w="120" w:type="dxa"/>
-              <w:right w:w="120" w:type="dxa"/>
-            </w:tcMar>
-            <w:tcBorders>
-              <w:top w:val="none" w:sz="4" w:space="0" w:color="auto"/>
-              <w:left w:val="none" w:sz="4" w:space="0" w:color="auto"/>
-              <w:bottom w:val="single" w:sz="4" w:space="0" w:color="E2E8F0"/>
-              <w:right w:val="none" w:sz="4" w:space="0" w:color="auto"/>
-              <w:insideH w:val="none"/>
-              <w:insideV w:val="none"/>
-            </w:tcBorders>
+            <w:tcW w:type="dxa" w:w="4320"/>
           </w:tcPr>
           <w:p>
             <w:r>
-              <w:rPr>
-                <w:rFonts w:ascii="Calibri" w:hAnsi="Calibri"/>
-                <w:color w:val="334155"/>
-                <w:sz w:val="20"/>
-              </w:rPr>
-              <w:t>true / false</w:t>
-            </w:r>
-          </w:p>
-        </w:tc>
-        <w:tc>
-          <w:tcPr>
-            <w:tcW w:type="dxa" w:w="3168"/>
-            <w:shd w:fill="FFFFFF"/>
-            <w:tcMar>
-              <w:top w:w="100" w:type="dxa"/>
-              <w:bottom w:w="100" w:type="dxa"/>
-              <w:left w:w="120" w:type="dxa"/>
-              <w:right w:w="120" w:type="dxa"/>
-            </w:tcMar>
-            <w:tcBorders>
-              <w:top w:val="none" w:sz="4" w:space="0" w:color="auto"/>
-              <w:left w:val="none" w:sz="4" w:space="0" w:color="auto"/>
-              <w:bottom w:val="single" w:sz="4" w:space="0" w:color="E2E8F0"/>
-              <w:right w:val="none" w:sz="4" w:space="0" w:color="auto"/>
-              <w:insideH w:val="none"/>
-              <w:insideV w:val="none"/>
-            </w:tcBorders>
-          </w:tcPr>
-          <w:p>
-            <w:r>
-              <w:rPr>
-                <w:rFonts w:ascii="Calibri" w:hAnsi="Calibri"/>
-                <w:color w:val="334155"/>
-                <w:sz w:val="20"/>
-              </w:rPr>
-              <w:t>Включение отправки email (строго true)</w:t>
-            </w:r>
-          </w:p>
-        </w:tc>
-        <w:tc>
-          <w:tcPr>
-            <w:tcW w:type="dxa" w:w="2160"/>
-            <w:shd w:fill="FFFFFF"/>
-            <w:tcMar>
-              <w:top w:w="100" w:type="dxa"/>
-              <w:bottom w:w="100" w:type="dxa"/>
-              <w:left w:w="120" w:type="dxa"/>
-              <w:right w:w="120" w:type="dxa"/>
-            </w:tcMar>
-            <w:tcBorders>
-              <w:top w:val="none" w:sz="4" w:space="0" w:color="auto"/>
-              <w:left w:val="none" w:sz="4" w:space="0" w:color="auto"/>
-              <w:bottom w:val="single" w:sz="4" w:space="0" w:color="E2E8F0"/>
-              <w:right w:val="none" w:sz="4" w:space="0" w:color="auto"/>
-              <w:insideH w:val="none"/>
-              <w:insideV w:val="none"/>
-            </w:tcBorders>
-          </w:tcPr>
-          <w:p>
-            <w:r>
-              <w:rPr>
-                <w:rFonts w:ascii="Calibri" w:hAnsi="Calibri"/>
-                <w:color w:val="334155"/>
-                <w:sz w:val="20"/>
-              </w:rPr>
-              <w:t>true</w:t>
+              <w:t>Строго true для worker; без неё --apply не выполняет отправку.</w:t>
             </w:r>
           </w:p>
         </w:tc>
@@ -459,121 +91,21 @@
       <w:tr>
         <w:tc>
           <w:tcPr>
-            <w:tcW w:type="dxa" w:w="2592"/>
-            <w:shd w:fill="F8FAFC"/>
-            <w:tcMar>
-              <w:top w:w="100" w:type="dxa"/>
-              <w:bottom w:w="100" w:type="dxa"/>
-              <w:left w:w="120" w:type="dxa"/>
-              <w:right w:w="120" w:type="dxa"/>
-            </w:tcMar>
-            <w:tcBorders>
-              <w:top w:val="none" w:sz="4" w:space="0" w:color="auto"/>
-              <w:left w:val="none" w:sz="4" w:space="0" w:color="auto"/>
-              <w:bottom w:val="single" w:sz="4" w:space="0" w:color="E2E8F0"/>
-              <w:right w:val="none" w:sz="4" w:space="0" w:color="auto"/>
-              <w:insideH w:val="none"/>
-              <w:insideV w:val="none"/>
-            </w:tcBorders>
+            <w:tcW w:type="dxa" w:w="4320"/>
           </w:tcPr>
           <w:p>
             <w:r>
-              <w:rPr>
-                <w:rFonts w:ascii="Consolas" w:hAnsi="Consolas"/>
-                <w:color w:val="0F172A"/>
-                <w:sz w:val="19"/>
-              </w:rPr>
               <w:t>CONTACT_SMTP_HOST</w:t>
             </w:r>
           </w:p>
         </w:tc>
         <w:tc>
           <w:tcPr>
-            <w:tcW w:type="dxa" w:w="1440"/>
-            <w:shd w:fill="F8FAFC"/>
-            <w:tcMar>
-              <w:top w:w="100" w:type="dxa"/>
-              <w:bottom w:w="100" w:type="dxa"/>
-              <w:left w:w="120" w:type="dxa"/>
-              <w:right w:w="120" w:type="dxa"/>
-            </w:tcMar>
-            <w:tcBorders>
-              <w:top w:val="none" w:sz="4" w:space="0" w:color="auto"/>
-              <w:left w:val="none" w:sz="4" w:space="0" w:color="auto"/>
-              <w:bottom w:val="single" w:sz="4" w:space="0" w:color="E2E8F0"/>
-              <w:right w:val="none" w:sz="4" w:space="0" w:color="auto"/>
-              <w:insideH w:val="none"/>
-              <w:insideV w:val="none"/>
-            </w:tcBorders>
+            <w:tcW w:type="dxa" w:w="4320"/>
           </w:tcPr>
           <w:p>
             <w:r>
-              <w:rPr>
-                <w:rFonts w:ascii="Calibri" w:hAnsi="Calibri"/>
-                <w:color w:val="334155"/>
-                <w:sz w:val="20"/>
-              </w:rPr>
-              <w:t>хост / IP</w:t>
-            </w:r>
-          </w:p>
-        </w:tc>
-        <w:tc>
-          <w:tcPr>
-            <w:tcW w:type="dxa" w:w="3168"/>
-            <w:shd w:fill="F8FAFC"/>
-            <w:tcMar>
-              <w:top w:w="100" w:type="dxa"/>
-              <w:bottom w:w="100" w:type="dxa"/>
-              <w:left w:w="120" w:type="dxa"/>
-              <w:right w:w="120" w:type="dxa"/>
-            </w:tcMar>
-            <w:tcBorders>
-              <w:top w:val="none" w:sz="4" w:space="0" w:color="auto"/>
-              <w:left w:val="none" w:sz="4" w:space="0" w:color="auto"/>
-              <w:bottom w:val="single" w:sz="4" w:space="0" w:color="E2E8F0"/>
-              <w:right w:val="none" w:sz="4" w:space="0" w:color="auto"/>
-              <w:insideH w:val="none"/>
-              <w:insideV w:val="none"/>
-            </w:tcBorders>
-          </w:tcPr>
-          <w:p>
-            <w:r>
-              <w:rPr>
-                <w:rFonts w:ascii="Calibri" w:hAnsi="Calibri"/>
-                <w:color w:val="334155"/>
-                <w:sz w:val="20"/>
-              </w:rPr>
-              <w:t>Адрес исходящего почтового SMTP-сервера</w:t>
-            </w:r>
-          </w:p>
-        </w:tc>
-        <w:tc>
-          <w:tcPr>
-            <w:tcW w:type="dxa" w:w="2160"/>
-            <w:shd w:fill="F8FAFC"/>
-            <w:tcMar>
-              <w:top w:w="100" w:type="dxa"/>
-              <w:bottom w:w="100" w:type="dxa"/>
-              <w:left w:w="120" w:type="dxa"/>
-              <w:right w:w="120" w:type="dxa"/>
-            </w:tcMar>
-            <w:tcBorders>
-              <w:top w:val="none" w:sz="4" w:space="0" w:color="auto"/>
-              <w:left w:val="none" w:sz="4" w:space="0" w:color="auto"/>
-              <w:bottom w:val="single" w:sz="4" w:space="0" w:color="E2E8F0"/>
-              <w:right w:val="none" w:sz="4" w:space="0" w:color="auto"/>
-              <w:insideH w:val="none"/>
-              <w:insideV w:val="none"/>
-            </w:tcBorders>
-          </w:tcPr>
-          <w:p>
-            <w:r>
-              <w:rPr>
-                <w:rFonts w:ascii="Calibri" w:hAnsi="Calibri"/>
-                <w:color w:val="334155"/>
-                <w:sz w:val="20"/>
-              </w:rPr>
-              <w:t>mail.miracon.gr</w:t>
+              <w:t>Имя исходящего SMTP-сервера, соответствующее его TLS-сертификату.</w:t>
             </w:r>
           </w:p>
         </w:tc>
@@ -581,121 +113,21 @@
       <w:tr>
         <w:tc>
           <w:tcPr>
-            <w:tcW w:type="dxa" w:w="2592"/>
-            <w:shd w:fill="FFFFFF"/>
-            <w:tcMar>
-              <w:top w:w="100" w:type="dxa"/>
-              <w:bottom w:w="100" w:type="dxa"/>
-              <w:left w:w="120" w:type="dxa"/>
-              <w:right w:w="120" w:type="dxa"/>
-            </w:tcMar>
-            <w:tcBorders>
-              <w:top w:val="none" w:sz="4" w:space="0" w:color="auto"/>
-              <w:left w:val="none" w:sz="4" w:space="0" w:color="auto"/>
-              <w:bottom w:val="single" w:sz="4" w:space="0" w:color="E2E8F0"/>
-              <w:right w:val="none" w:sz="4" w:space="0" w:color="auto"/>
-              <w:insideH w:val="none"/>
-              <w:insideV w:val="none"/>
-            </w:tcBorders>
+            <w:tcW w:type="dxa" w:w="4320"/>
           </w:tcPr>
           <w:p>
             <w:r>
-              <w:rPr>
-                <w:rFonts w:ascii="Consolas" w:hAnsi="Consolas"/>
-                <w:color w:val="0F172A"/>
-                <w:sz w:val="19"/>
-              </w:rPr>
               <w:t>CONTACT_SMTP_PORT</w:t>
             </w:r>
           </w:p>
         </w:tc>
         <w:tc>
           <w:tcPr>
-            <w:tcW w:type="dxa" w:w="1440"/>
-            <w:shd w:fill="FFFFFF"/>
-            <w:tcMar>
-              <w:top w:w="100" w:type="dxa"/>
-              <w:bottom w:w="100" w:type="dxa"/>
-              <w:left w:w="120" w:type="dxa"/>
-              <w:right w:w="120" w:type="dxa"/>
-            </w:tcMar>
-            <w:tcBorders>
-              <w:top w:val="none" w:sz="4" w:space="0" w:color="auto"/>
-              <w:left w:val="none" w:sz="4" w:space="0" w:color="auto"/>
-              <w:bottom w:val="single" w:sz="4" w:space="0" w:color="E2E8F0"/>
-              <w:right w:val="none" w:sz="4" w:space="0" w:color="auto"/>
-              <w:insideH w:val="none"/>
-              <w:insideV w:val="none"/>
-            </w:tcBorders>
+            <w:tcW w:type="dxa" w:w="4320"/>
           </w:tcPr>
           <w:p>
             <w:r>
-              <w:rPr>
-                <w:rFonts w:ascii="Calibri" w:hAnsi="Calibri"/>
-                <w:color w:val="334155"/>
-                <w:sz w:val="20"/>
-              </w:rPr>
-              <w:t>465 / 587</w:t>
-            </w:r>
-          </w:p>
-        </w:tc>
-        <w:tc>
-          <w:tcPr>
-            <w:tcW w:type="dxa" w:w="3168"/>
-            <w:shd w:fill="FFFFFF"/>
-            <w:tcMar>
-              <w:top w:w="100" w:type="dxa"/>
-              <w:bottom w:w="100" w:type="dxa"/>
-              <w:left w:w="120" w:type="dxa"/>
-              <w:right w:w="120" w:type="dxa"/>
-            </w:tcMar>
-            <w:tcBorders>
-              <w:top w:val="none" w:sz="4" w:space="0" w:color="auto"/>
-              <w:left w:val="none" w:sz="4" w:space="0" w:color="auto"/>
-              <w:bottom w:val="single" w:sz="4" w:space="0" w:color="E2E8F0"/>
-              <w:right w:val="none" w:sz="4" w:space="0" w:color="auto"/>
-              <w:insideH w:val="none"/>
-              <w:insideV w:val="none"/>
-            </w:tcBorders>
-          </w:tcPr>
-          <w:p>
-            <w:r>
-              <w:rPr>
-                <w:rFonts w:ascii="Calibri" w:hAnsi="Calibri"/>
-                <w:color w:val="334155"/>
-                <w:sz w:val="20"/>
-              </w:rPr>
-              <w:t>Порт SMTP (465 = SSL, 587 = STARTTLS)</w:t>
-            </w:r>
-          </w:p>
-        </w:tc>
-        <w:tc>
-          <w:tcPr>
-            <w:tcW w:type="dxa" w:w="2160"/>
-            <w:shd w:fill="FFFFFF"/>
-            <w:tcMar>
-              <w:top w:w="100" w:type="dxa"/>
-              <w:bottom w:w="100" w:type="dxa"/>
-              <w:left w:w="120" w:type="dxa"/>
-              <w:right w:w="120" w:type="dxa"/>
-            </w:tcMar>
-            <w:tcBorders>
-              <w:top w:val="none" w:sz="4" w:space="0" w:color="auto"/>
-              <w:left w:val="none" w:sz="4" w:space="0" w:color="auto"/>
-              <w:bottom w:val="single" w:sz="4" w:space="0" w:color="E2E8F0"/>
-              <w:right w:val="none" w:sz="4" w:space="0" w:color="auto"/>
-              <w:insideH w:val="none"/>
-              <w:insideV w:val="none"/>
-            </w:tcBorders>
-          </w:tcPr>
-          <w:p>
-            <w:r>
-              <w:rPr>
-                <w:rFonts w:ascii="Calibri" w:hAnsi="Calibri"/>
-                <w:color w:val="334155"/>
-                <w:sz w:val="20"/>
-              </w:rPr>
-              <w:t>465</w:t>
+              <w:t>465 (TLS) или 587 (обязательный STARTTLS).</w:t>
             </w:r>
           </w:p>
         </w:tc>
@@ -703,121 +135,21 @@
       <w:tr>
         <w:tc>
           <w:tcPr>
-            <w:tcW w:type="dxa" w:w="2592"/>
-            <w:shd w:fill="F8FAFC"/>
-            <w:tcMar>
-              <w:top w:w="100" w:type="dxa"/>
-              <w:bottom w:w="100" w:type="dxa"/>
-              <w:left w:w="120" w:type="dxa"/>
-              <w:right w:w="120" w:type="dxa"/>
-            </w:tcMar>
-            <w:tcBorders>
-              <w:top w:val="none" w:sz="4" w:space="0" w:color="auto"/>
-              <w:left w:val="none" w:sz="4" w:space="0" w:color="auto"/>
-              <w:bottom w:val="single" w:sz="4" w:space="0" w:color="E2E8F0"/>
-              <w:right w:val="none" w:sz="4" w:space="0" w:color="auto"/>
-              <w:insideH w:val="none"/>
-              <w:insideV w:val="none"/>
-            </w:tcBorders>
+            <w:tcW w:type="dxa" w:w="4320"/>
           </w:tcPr>
           <w:p>
             <w:r>
-              <w:rPr>
-                <w:rFonts w:ascii="Consolas" w:hAnsi="Consolas"/>
-                <w:color w:val="0F172A"/>
-                <w:sz w:val="19"/>
-              </w:rPr>
               <w:t>CONTACT_SMTP_USER</w:t>
             </w:r>
           </w:p>
         </w:tc>
         <w:tc>
           <w:tcPr>
-            <w:tcW w:type="dxa" w:w="1440"/>
-            <w:shd w:fill="F8FAFC"/>
-            <w:tcMar>
-              <w:top w:w="100" w:type="dxa"/>
-              <w:bottom w:w="100" w:type="dxa"/>
-              <w:left w:w="120" w:type="dxa"/>
-              <w:right w:w="120" w:type="dxa"/>
-            </w:tcMar>
-            <w:tcBorders>
-              <w:top w:val="none" w:sz="4" w:space="0" w:color="auto"/>
-              <w:left w:val="none" w:sz="4" w:space="0" w:color="auto"/>
-              <w:bottom w:val="single" w:sz="4" w:space="0" w:color="E2E8F0"/>
-              <w:right w:val="none" w:sz="4" w:space="0" w:color="auto"/>
-              <w:insideH w:val="none"/>
-              <w:insideV w:val="none"/>
-            </w:tcBorders>
+            <w:tcW w:type="dxa" w:w="4320"/>
           </w:tcPr>
           <w:p>
             <w:r>
-              <w:rPr>
-                <w:rFonts w:ascii="Calibri" w:hAnsi="Calibri"/>
-                <w:color w:val="334155"/>
-                <w:sz w:val="20"/>
-              </w:rPr>
-              <w:t>строка</w:t>
-            </w:r>
-          </w:p>
-        </w:tc>
-        <w:tc>
-          <w:tcPr>
-            <w:tcW w:type="dxa" w:w="3168"/>
-            <w:shd w:fill="F8FAFC"/>
-            <w:tcMar>
-              <w:top w:w="100" w:type="dxa"/>
-              <w:bottom w:w="100" w:type="dxa"/>
-              <w:left w:w="120" w:type="dxa"/>
-              <w:right w:w="120" w:type="dxa"/>
-            </w:tcMar>
-            <w:tcBorders>
-              <w:top w:val="none" w:sz="4" w:space="0" w:color="auto"/>
-              <w:left w:val="none" w:sz="4" w:space="0" w:color="auto"/>
-              <w:bottom w:val="single" w:sz="4" w:space="0" w:color="E2E8F0"/>
-              <w:right w:val="none" w:sz="4" w:space="0" w:color="auto"/>
-              <w:insideH w:val="none"/>
-              <w:insideV w:val="none"/>
-            </w:tcBorders>
-          </w:tcPr>
-          <w:p>
-            <w:r>
-              <w:rPr>
-                <w:rFonts w:ascii="Calibri" w:hAnsi="Calibri"/>
-                <w:color w:val="334155"/>
-                <w:sz w:val="20"/>
-              </w:rPr>
-              <w:t>Логин учетной записи почты</w:t>
-            </w:r>
-          </w:p>
-        </w:tc>
-        <w:tc>
-          <w:tcPr>
-            <w:tcW w:type="dxa" w:w="2160"/>
-            <w:shd w:fill="F8FAFC"/>
-            <w:tcMar>
-              <w:top w:w="100" w:type="dxa"/>
-              <w:bottom w:w="100" w:type="dxa"/>
-              <w:left w:w="120" w:type="dxa"/>
-              <w:right w:w="120" w:type="dxa"/>
-            </w:tcMar>
-            <w:tcBorders>
-              <w:top w:val="none" w:sz="4" w:space="0" w:color="auto"/>
-              <w:left w:val="none" w:sz="4" w:space="0" w:color="auto"/>
-              <w:bottom w:val="single" w:sz="4" w:space="0" w:color="E2E8F0"/>
-              <w:right w:val="none" w:sz="4" w:space="0" w:color="auto"/>
-              <w:insideH w:val="none"/>
-              <w:insideV w:val="none"/>
-            </w:tcBorders>
-          </w:tcPr>
-          <w:p>
-            <w:r>
-              <w:rPr>
-                <w:rFonts w:ascii="Calibri" w:hAnsi="Calibri"/>
-                <w:color w:val="334155"/>
-                <w:sz w:val="20"/>
-              </w:rPr>
-              <w:t>info@miracon.gr</w:t>
+              <w:t>Логин SMTP.</w:t>
             </w:r>
           </w:p>
         </w:tc>
@@ -825,121 +157,21 @@
       <w:tr>
         <w:tc>
           <w:tcPr>
-            <w:tcW w:type="dxa" w:w="2592"/>
-            <w:shd w:fill="FFFFFF"/>
-            <w:tcMar>
-              <w:top w:w="100" w:type="dxa"/>
-              <w:bottom w:w="100" w:type="dxa"/>
-              <w:left w:w="120" w:type="dxa"/>
-              <w:right w:w="120" w:type="dxa"/>
-            </w:tcMar>
-            <w:tcBorders>
-              <w:top w:val="none" w:sz="4" w:space="0" w:color="auto"/>
-              <w:left w:val="none" w:sz="4" w:space="0" w:color="auto"/>
-              <w:bottom w:val="single" w:sz="4" w:space="0" w:color="E2E8F0"/>
-              <w:right w:val="none" w:sz="4" w:space="0" w:color="auto"/>
-              <w:insideH w:val="none"/>
-              <w:insideV w:val="none"/>
-            </w:tcBorders>
+            <w:tcW w:type="dxa" w:w="4320"/>
           </w:tcPr>
           <w:p>
             <w:r>
-              <w:rPr>
-                <w:rFonts w:ascii="Consolas" w:hAnsi="Consolas"/>
-                <w:color w:val="0F172A"/>
-                <w:sz w:val="19"/>
-              </w:rPr>
               <w:t>CONTACT_SMTP_PASSWORD</w:t>
             </w:r>
           </w:p>
         </w:tc>
         <w:tc>
           <w:tcPr>
-            <w:tcW w:type="dxa" w:w="1440"/>
-            <w:shd w:fill="FFFFFF"/>
-            <w:tcMar>
-              <w:top w:w="100" w:type="dxa"/>
-              <w:bottom w:w="100" w:type="dxa"/>
-              <w:left w:w="120" w:type="dxa"/>
-              <w:right w:w="120" w:type="dxa"/>
-            </w:tcMar>
-            <w:tcBorders>
-              <w:top w:val="none" w:sz="4" w:space="0" w:color="auto"/>
-              <w:left w:val="none" w:sz="4" w:space="0" w:color="auto"/>
-              <w:bottom w:val="single" w:sz="4" w:space="0" w:color="E2E8F0"/>
-              <w:right w:val="none" w:sz="4" w:space="0" w:color="auto"/>
-              <w:insideH w:val="none"/>
-              <w:insideV w:val="none"/>
-            </w:tcBorders>
+            <w:tcW w:type="dxa" w:w="4320"/>
           </w:tcPr>
           <w:p>
             <w:r>
-              <w:rPr>
-                <w:rFonts w:ascii="Calibri" w:hAnsi="Calibri"/>
-                <w:color w:val="334155"/>
-                <w:sz w:val="20"/>
-              </w:rPr>
-              <w:t>строка</w:t>
-            </w:r>
-          </w:p>
-        </w:tc>
-        <w:tc>
-          <w:tcPr>
-            <w:tcW w:type="dxa" w:w="3168"/>
-            <w:shd w:fill="FFFFFF"/>
-            <w:tcMar>
-              <w:top w:w="100" w:type="dxa"/>
-              <w:bottom w:w="100" w:type="dxa"/>
-              <w:left w:w="120" w:type="dxa"/>
-              <w:right w:w="120" w:type="dxa"/>
-            </w:tcMar>
-            <w:tcBorders>
-              <w:top w:val="none" w:sz="4" w:space="0" w:color="auto"/>
-              <w:left w:val="none" w:sz="4" w:space="0" w:color="auto"/>
-              <w:bottom w:val="single" w:sz="4" w:space="0" w:color="E2E8F0"/>
-              <w:right w:val="none" w:sz="4" w:space="0" w:color="auto"/>
-              <w:insideH w:val="none"/>
-              <w:insideV w:val="none"/>
-            </w:tcBorders>
-          </w:tcPr>
-          <w:p>
-            <w:r>
-              <w:rPr>
-                <w:rFonts w:ascii="Calibri" w:hAnsi="Calibri"/>
-                <w:color w:val="334155"/>
-                <w:sz w:val="20"/>
-              </w:rPr>
-              <w:t>Пароль ящика или пароль приложения</w:t>
-            </w:r>
-          </w:p>
-        </w:tc>
-        <w:tc>
-          <w:tcPr>
-            <w:tcW w:type="dxa" w:w="2160"/>
-            <w:shd w:fill="FFFFFF"/>
-            <w:tcMar>
-              <w:top w:w="100" w:type="dxa"/>
-              <w:bottom w:w="100" w:type="dxa"/>
-              <w:left w:w="120" w:type="dxa"/>
-              <w:right w:w="120" w:type="dxa"/>
-            </w:tcMar>
-            <w:tcBorders>
-              <w:top w:val="none" w:sz="4" w:space="0" w:color="auto"/>
-              <w:left w:val="none" w:sz="4" w:space="0" w:color="auto"/>
-              <w:bottom w:val="single" w:sz="4" w:space="0" w:color="E2E8F0"/>
-              <w:right w:val="none" w:sz="4" w:space="0" w:color="auto"/>
-              <w:insideH w:val="none"/>
-              <w:insideV w:val="none"/>
-            </w:tcBorders>
-          </w:tcPr>
-          <w:p>
-            <w:r>
-              <w:rPr>
-                <w:rFonts w:ascii="Calibri" w:hAnsi="Calibri"/>
-                <w:color w:val="334155"/>
-                <w:sz w:val="20"/>
-              </w:rPr>
-              <w:t>ВашПароль123</w:t>
+              <w:t>Пароль SMTP / отдельный пароль приложения.</w:t>
             </w:r>
           </w:p>
         </w:tc>
@@ -947,121 +179,21 @@
       <w:tr>
         <w:tc>
           <w:tcPr>
-            <w:tcW w:type="dxa" w:w="2592"/>
-            <w:shd w:fill="F8FAFC"/>
-            <w:tcMar>
-              <w:top w:w="100" w:type="dxa"/>
-              <w:bottom w:w="100" w:type="dxa"/>
-              <w:left w:w="120" w:type="dxa"/>
-              <w:right w:w="120" w:type="dxa"/>
-            </w:tcMar>
-            <w:tcBorders>
-              <w:top w:val="none" w:sz="4" w:space="0" w:color="auto"/>
-              <w:left w:val="none" w:sz="4" w:space="0" w:color="auto"/>
-              <w:bottom w:val="single" w:sz="4" w:space="0" w:color="E2E8F0"/>
-              <w:right w:val="none" w:sz="4" w:space="0" w:color="auto"/>
-              <w:insideH w:val="none"/>
-              <w:insideV w:val="none"/>
-            </w:tcBorders>
+            <w:tcW w:type="dxa" w:w="4320"/>
           </w:tcPr>
           <w:p>
             <w:r>
-              <w:rPr>
-                <w:rFonts w:ascii="Consolas" w:hAnsi="Consolas"/>
-                <w:color w:val="0F172A"/>
-                <w:sz w:val="19"/>
-              </w:rPr>
               <w:t>CONTACT_SMTP_FROM</w:t>
             </w:r>
           </w:p>
         </w:tc>
         <w:tc>
           <w:tcPr>
-            <w:tcW w:type="dxa" w:w="1440"/>
-            <w:shd w:fill="F8FAFC"/>
-            <w:tcMar>
-              <w:top w:w="100" w:type="dxa"/>
-              <w:bottom w:w="100" w:type="dxa"/>
-              <w:left w:w="120" w:type="dxa"/>
-              <w:right w:w="120" w:type="dxa"/>
-            </w:tcMar>
-            <w:tcBorders>
-              <w:top w:val="none" w:sz="4" w:space="0" w:color="auto"/>
-              <w:left w:val="none" w:sz="4" w:space="0" w:color="auto"/>
-              <w:bottom w:val="single" w:sz="4" w:space="0" w:color="E2E8F0"/>
-              <w:right w:val="none" w:sz="4" w:space="0" w:color="auto"/>
-              <w:insideH w:val="none"/>
-              <w:insideV w:val="none"/>
-            </w:tcBorders>
+            <w:tcW w:type="dxa" w:w="4320"/>
           </w:tcPr>
           <w:p>
             <w:r>
-              <w:rPr>
-                <w:rFonts w:ascii="Calibri" w:hAnsi="Calibri"/>
-                <w:color w:val="334155"/>
-                <w:sz w:val="20"/>
-              </w:rPr>
-              <w:t>email</w:t>
-            </w:r>
-          </w:p>
-        </w:tc>
-        <w:tc>
-          <w:tcPr>
-            <w:tcW w:type="dxa" w:w="3168"/>
-            <w:shd w:fill="F8FAFC"/>
-            <w:tcMar>
-              <w:top w:w="100" w:type="dxa"/>
-              <w:bottom w:w="100" w:type="dxa"/>
-              <w:left w:w="120" w:type="dxa"/>
-              <w:right w:w="120" w:type="dxa"/>
-            </w:tcMar>
-            <w:tcBorders>
-              <w:top w:val="none" w:sz="4" w:space="0" w:color="auto"/>
-              <w:left w:val="none" w:sz="4" w:space="0" w:color="auto"/>
-              <w:bottom w:val="single" w:sz="4" w:space="0" w:color="E2E8F0"/>
-              <w:right w:val="none" w:sz="4" w:space="0" w:color="auto"/>
-              <w:insideH w:val="none"/>
-              <w:insideV w:val="none"/>
-            </w:tcBorders>
-          </w:tcPr>
-          <w:p>
-            <w:r>
-              <w:rPr>
-                <w:rFonts w:ascii="Calibri" w:hAnsi="Calibri"/>
-                <w:color w:val="334155"/>
-                <w:sz w:val="20"/>
-              </w:rPr>
-              <w:t>Адрес в заголовке 'От кого'</w:t>
-            </w:r>
-          </w:p>
-        </w:tc>
-        <w:tc>
-          <w:tcPr>
-            <w:tcW w:type="dxa" w:w="2160"/>
-            <w:shd w:fill="F8FAFC"/>
-            <w:tcMar>
-              <w:top w:w="100" w:type="dxa"/>
-              <w:bottom w:w="100" w:type="dxa"/>
-              <w:left w:w="120" w:type="dxa"/>
-              <w:right w:w="120" w:type="dxa"/>
-            </w:tcMar>
-            <w:tcBorders>
-              <w:top w:val="none" w:sz="4" w:space="0" w:color="auto"/>
-              <w:left w:val="none" w:sz="4" w:space="0" w:color="auto"/>
-              <w:bottom w:val="single" w:sz="4" w:space="0" w:color="E2E8F0"/>
-              <w:right w:val="none" w:sz="4" w:space="0" w:color="auto"/>
-              <w:insideH w:val="none"/>
-              <w:insideV w:val="none"/>
-            </w:tcBorders>
-          </w:tcPr>
-          <w:p>
-            <w:r>
-              <w:rPr>
-                <w:rFonts w:ascii="Calibri" w:hAnsi="Calibri"/>
-                <w:color w:val="334155"/>
-                <w:sz w:val="20"/>
-              </w:rPr>
-              <w:t>info@miracon.gr</w:t>
+              <w:t>Почтовый адрес отправителя; принимать ответы должен обслуживаемый ящик.</w:t>
             </w:r>
           </w:p>
         </w:tc>
@@ -1069,121 +201,21 @@
       <w:tr>
         <w:tc>
           <w:tcPr>
-            <w:tcW w:type="dxa" w:w="2592"/>
-            <w:shd w:fill="FFFFFF"/>
-            <w:tcMar>
-              <w:top w:w="100" w:type="dxa"/>
-              <w:bottom w:w="100" w:type="dxa"/>
-              <w:left w:w="120" w:type="dxa"/>
-              <w:right w:w="120" w:type="dxa"/>
-            </w:tcMar>
-            <w:tcBorders>
-              <w:top w:val="none" w:sz="4" w:space="0" w:color="auto"/>
-              <w:left w:val="none" w:sz="4" w:space="0" w:color="auto"/>
-              <w:bottom w:val="single" w:sz="4" w:space="0" w:color="E2E8F0"/>
-              <w:right w:val="none" w:sz="4" w:space="0" w:color="auto"/>
-              <w:insideH w:val="none"/>
-              <w:insideV w:val="none"/>
-            </w:tcBorders>
+            <w:tcW w:type="dxa" w:w="4320"/>
           </w:tcPr>
           <w:p>
             <w:r>
-              <w:rPr>
-                <w:rFonts w:ascii="Consolas" w:hAnsi="Consolas"/>
-                <w:color w:val="0F172A"/>
-                <w:sz w:val="19"/>
-              </w:rPr>
               <w:t>CONTACT_SMTP_TO</w:t>
             </w:r>
           </w:p>
         </w:tc>
         <w:tc>
           <w:tcPr>
-            <w:tcW w:type="dxa" w:w="1440"/>
-            <w:shd w:fill="FFFFFF"/>
-            <w:tcMar>
-              <w:top w:w="100" w:type="dxa"/>
-              <w:bottom w:w="100" w:type="dxa"/>
-              <w:left w:w="120" w:type="dxa"/>
-              <w:right w:w="120" w:type="dxa"/>
-            </w:tcMar>
-            <w:tcBorders>
-              <w:top w:val="none" w:sz="4" w:space="0" w:color="auto"/>
-              <w:left w:val="none" w:sz="4" w:space="0" w:color="auto"/>
-              <w:bottom w:val="single" w:sz="4" w:space="0" w:color="E2E8F0"/>
-              <w:right w:val="none" w:sz="4" w:space="0" w:color="auto"/>
-              <w:insideH w:val="none"/>
-              <w:insideV w:val="none"/>
-            </w:tcBorders>
+            <w:tcW w:type="dxa" w:w="4320"/>
           </w:tcPr>
           <w:p>
             <w:r>
-              <w:rPr>
-                <w:rFonts w:ascii="Calibri" w:hAnsi="Calibri"/>
-                <w:color w:val="334155"/>
-                <w:sz w:val="20"/>
-              </w:rPr>
-              <w:t>email</w:t>
-            </w:r>
-          </w:p>
-        </w:tc>
-        <w:tc>
-          <w:tcPr>
-            <w:tcW w:type="dxa" w:w="3168"/>
-            <w:shd w:fill="FFFFFF"/>
-            <w:tcMar>
-              <w:top w:w="100" w:type="dxa"/>
-              <w:bottom w:w="100" w:type="dxa"/>
-              <w:left w:w="120" w:type="dxa"/>
-              <w:right w:w="120" w:type="dxa"/>
-            </w:tcMar>
-            <w:tcBorders>
-              <w:top w:val="none" w:sz="4" w:space="0" w:color="auto"/>
-              <w:left w:val="none" w:sz="4" w:space="0" w:color="auto"/>
-              <w:bottom w:val="single" w:sz="4" w:space="0" w:color="E2E8F0"/>
-              <w:right w:val="none" w:sz="4" w:space="0" w:color="auto"/>
-              <w:insideH w:val="none"/>
-              <w:insideV w:val="none"/>
-            </w:tcBorders>
-          </w:tcPr>
-          <w:p>
-            <w:r>
-              <w:rPr>
-                <w:rFonts w:ascii="Calibri" w:hAnsi="Calibri"/>
-                <w:color w:val="334155"/>
-                <w:sz w:val="20"/>
-              </w:rPr>
-              <w:t>Куда доставлять уведомления о заявках</w:t>
-            </w:r>
-          </w:p>
-        </w:tc>
-        <w:tc>
-          <w:tcPr>
-            <w:tcW w:type="dxa" w:w="2160"/>
-            <w:shd w:fill="FFFFFF"/>
-            <w:tcMar>
-              <w:top w:w="100" w:type="dxa"/>
-              <w:bottom w:w="100" w:type="dxa"/>
-              <w:left w:w="120" w:type="dxa"/>
-              <w:right w:w="120" w:type="dxa"/>
-            </w:tcMar>
-            <w:tcBorders>
-              <w:top w:val="none" w:sz="4" w:space="0" w:color="auto"/>
-              <w:left w:val="none" w:sz="4" w:space="0" w:color="auto"/>
-              <w:bottom w:val="single" w:sz="4" w:space="0" w:color="E2E8F0"/>
-              <w:right w:val="none" w:sz="4" w:space="0" w:color="auto"/>
-              <w:insideH w:val="none"/>
-              <w:insideV w:val="none"/>
-            </w:tcBorders>
-          </w:tcPr>
-          <w:p>
-            <w:r>
-              <w:rPr>
-                <w:rFonts w:ascii="Calibri" w:hAnsi="Calibri"/>
-                <w:color w:val="334155"/>
-                <w:sz w:val="20"/>
-              </w:rPr>
-              <w:t>info@miracon.gr</w:t>
+              <w:t>Один внутренний адрес для уведомлений о новых заявках.</w:t>
             </w:r>
           </w:p>
         </w:tc>
@@ -1191,225 +223,73 @@
       <w:tr>
         <w:tc>
           <w:tcPr>
-            <w:tcW w:type="dxa" w:w="2592"/>
-            <w:shd w:fill="F8FAFC"/>
-            <w:tcMar>
-              <w:top w:w="100" w:type="dxa"/>
-              <w:bottom w:w="100" w:type="dxa"/>
-              <w:left w:w="120" w:type="dxa"/>
-              <w:right w:w="120" w:type="dxa"/>
-            </w:tcMar>
-            <w:tcBorders>
-              <w:top w:val="none" w:sz="4" w:space="0" w:color="auto"/>
-              <w:left w:val="none" w:sz="4" w:space="0" w:color="auto"/>
-              <w:bottom w:val="single" w:sz="4" w:space="0" w:color="E2E8F0"/>
-              <w:right w:val="none" w:sz="4" w:space="0" w:color="auto"/>
-              <w:insideH w:val="none"/>
-              <w:insideV w:val="none"/>
-            </w:tcBorders>
+            <w:tcW w:type="dxa" w:w="4320"/>
           </w:tcPr>
           <w:p>
             <w:r>
-              <w:rPr>
-                <w:rFonts w:ascii="Consolas" w:hAnsi="Consolas"/>
-                <w:color w:val="0F172A"/>
-                <w:sz w:val="19"/>
-              </w:rPr>
+              <w:t>CONTACT_AUTOREPLY_ENABLED</w:t>
+            </w:r>
+          </w:p>
+        </w:tc>
+        <w:tc>
+          <w:tcPr>
+            <w:tcW w:type="dxa" w:w="4320"/>
+          </w:tcPr>
+          <w:p>
+            <w:r>
+              <w:t>Необязательная опция: true разрешает автоответ; по умолчанию выключен.</w:t>
+            </w:r>
+          </w:p>
+        </w:tc>
+      </w:tr>
+      <w:tr>
+        <w:tc>
+          <w:tcPr>
+            <w:tcW w:type="dxa" w:w="4320"/>
+          </w:tcPr>
+          <w:p>
+            <w:r>
+              <w:t>DATABASE_URL</w:t>
+            </w:r>
+          </w:p>
+        </w:tc>
+        <w:tc>
+          <w:tcPr>
+            <w:tcW w:type="dxa" w:w="4320"/>
+          </w:tcPr>
+          <w:p>
+            <w:r>
+              <w:t>PostgreSQL для сайта и Cron; хранить вне публичного каталога.</w:t>
+            </w:r>
+          </w:p>
+        </w:tc>
+      </w:tr>
+      <w:tr>
+        <w:tc>
+          <w:tcPr>
+            <w:tcW w:type="dxa" w:w="4320"/>
+          </w:tcPr>
+          <w:p>
+            <w:r>
               <w:t>CONTACT_DIGEST_SECRET</w:t>
             </w:r>
           </w:p>
         </w:tc>
         <w:tc>
           <w:tcPr>
-            <w:tcW w:type="dxa" w:w="1440"/>
-            <w:shd w:fill="F8FAFC"/>
-            <w:tcMar>
-              <w:top w:w="100" w:type="dxa"/>
-              <w:bottom w:w="100" w:type="dxa"/>
-              <w:left w:w="120" w:type="dxa"/>
-              <w:right w:w="120" w:type="dxa"/>
-            </w:tcMar>
-            <w:tcBorders>
-              <w:top w:val="none" w:sz="4" w:space="0" w:color="auto"/>
-              <w:left w:val="none" w:sz="4" w:space="0" w:color="auto"/>
-              <w:bottom w:val="single" w:sz="4" w:space="0" w:color="E2E8F0"/>
-              <w:right w:val="none" w:sz="4" w:space="0" w:color="auto"/>
-              <w:insideH w:val="none"/>
-              <w:insideV w:val="none"/>
-            </w:tcBorders>
+            <w:tcW w:type="dxa" w:w="4320"/>
           </w:tcPr>
           <w:p>
             <w:r>
-              <w:rPr>
-                <w:rFonts w:ascii="Calibri" w:hAnsi="Calibri"/>
-                <w:color w:val="334155"/>
-                <w:sz w:val="20"/>
-              </w:rPr>
-              <w:t>строка ≥ 32</w:t>
-            </w:r>
-          </w:p>
-        </w:tc>
-        <w:tc>
-          <w:tcPr>
-            <w:tcW w:type="dxa" w:w="3168"/>
-            <w:shd w:fill="F8FAFC"/>
-            <w:tcMar>
-              <w:top w:w="100" w:type="dxa"/>
-              <w:bottom w:w="100" w:type="dxa"/>
-              <w:left w:w="120" w:type="dxa"/>
-              <w:right w:w="120" w:type="dxa"/>
-            </w:tcMar>
-            <w:tcBorders>
-              <w:top w:val="none" w:sz="4" w:space="0" w:color="auto"/>
-              <w:left w:val="none" w:sz="4" w:space="0" w:color="auto"/>
-              <w:bottom w:val="single" w:sz="4" w:space="0" w:color="E2E8F0"/>
-              <w:right w:val="none" w:sz="4" w:space="0" w:color="auto"/>
-              <w:insideH w:val="none"/>
-              <w:insideV w:val="none"/>
-            </w:tcBorders>
-          </w:tcPr>
-          <w:p>
-            <w:r>
-              <w:rPr>
-                <w:rFonts w:ascii="Calibri" w:hAnsi="Calibri"/>
-                <w:color w:val="334155"/>
-                <w:sz w:val="20"/>
-              </w:rPr>
-              <w:t>Ключ защиты от спама и дубликатов</w:t>
-            </w:r>
-          </w:p>
-        </w:tc>
-        <w:tc>
-          <w:tcPr>
-            <w:tcW w:type="dxa" w:w="2160"/>
-            <w:shd w:fill="F8FAFC"/>
-            <w:tcMar>
-              <w:top w:w="100" w:type="dxa"/>
-              <w:bottom w:w="100" w:type="dxa"/>
-              <w:left w:w="120" w:type="dxa"/>
-              <w:right w:w="120" w:type="dxa"/>
-            </w:tcMar>
-            <w:tcBorders>
-              <w:top w:val="none" w:sz="4" w:space="0" w:color="auto"/>
-              <w:left w:val="none" w:sz="4" w:space="0" w:color="auto"/>
-              <w:bottom w:val="single" w:sz="4" w:space="0" w:color="E2E8F0"/>
-              <w:right w:val="none" w:sz="4" w:space="0" w:color="auto"/>
-              <w:insideH w:val="none"/>
-              <w:insideV w:val="none"/>
-            </w:tcBorders>
-          </w:tcPr>
-          <w:p>
-            <w:r>
-              <w:rPr>
-                <w:rFonts w:ascii="Calibri" w:hAnsi="Calibri"/>
-                <w:color w:val="334155"/>
-                <w:sz w:val="20"/>
-              </w:rPr>
-              <w:t>Случайная строка от 32 симв.</w:t>
+              <w:t>Не менее 32 символов для защиты формы; хранить вне публичного каталога.</w:t>
             </w:r>
           </w:p>
         </w:tc>
       </w:tr>
     </w:tbl>
     <w:p>
-      <w:pPr>
-        <w:spacing w:after="80"/>
-      </w:pPr>
-    </w:p>
-    <w:tbl>
-      <w:tblPr>
-        <w:tblW w:type="auto" w:w="0"/>
-        <w:jc w:val="center"/>
-        <w:tblLayout w:type="fixed"/>
-        <w:tblLook w:firstColumn="1" w:firstRow="1" w:lastColumn="0" w:lastRow="0" w:noHBand="0" w:noVBand="1" w:val="04A0"/>
-      </w:tblPr>
-      <w:tblGrid>
-        <w:gridCol w:w="9360"/>
-      </w:tblGrid>
-      <w:tr>
-        <w:tc>
-          <w:tcPr>
-            <w:tcW w:type="dxa" w:w="9792"/>
-            <w:shd w:fill="FFFBEB"/>
-            <w:tcMar>
-              <w:top w:w="160" w:type="dxa"/>
-              <w:bottom w:w="160" w:type="dxa"/>
-              <w:left w:w="240" w:type="dxa"/>
-              <w:right w:w="200" w:type="dxa"/>
-            </w:tcMar>
-            <w:tcBorders>
-              <w:top w:val="none" w:sz="4" w:space="0" w:color="auto"/>
-              <w:left w:val="single" w:sz="24" w:space="0" w:color="D97706"/>
-              <w:bottom w:val="none" w:sz="4" w:space="0" w:color="auto"/>
-              <w:right w:val="none" w:sz="4" w:space="0" w:color="auto"/>
-              <w:insideH w:val="none"/>
-              <w:insideV w:val="none"/>
-            </w:tcBorders>
-          </w:tcPr>
-          <w:p>
-            <w:pPr>
-              <w:spacing w:before="40" w:after="80"/>
-            </w:pPr>
-            <w:r>
-              <w:rPr>
-                <w:rFonts w:ascii="Calibri" w:hAnsi="Calibri"/>
-                <w:b/>
-                <w:color w:val="1E40AF"/>
-                <w:sz w:val="21"/>
-              </w:rPr>
-              <w:t>📌 ТЕХНИЧЕСКИЕ ТРЕБОВАНИЯ ВАЛИДАТОРА СИСТЕМЫ</w:t>
-              <w:br/>
-            </w:r>
-            <w:r>
-              <w:rPr>
-                <w:rFonts w:ascii="Calibri" w:hAnsi="Calibri"/>
-                <w:color w:val="1E293B"/>
-                <w:sz w:val="20"/>
-              </w:rPr>
-              <w:t>1. Переменная CONTACT_SMTP_PORT принимает исключительно значения 465 или 587. Небезопасный порт 25 заблокирован встроенной валидацией приложения.</w:t>
-            </w:r>
-          </w:p>
-          <w:p>
-            <w:pPr>
-              <w:spacing w:before="40" w:after="80"/>
-            </w:pPr>
-            <w:r>
-              <w:rPr>
-                <w:rFonts w:ascii="Calibri" w:hAnsi="Calibri"/>
-                <w:color w:val="1E293B"/>
-                <w:sz w:val="20"/>
-              </w:rPr>
-              <w:t>2. Переменные являются строго серверными. Ни в коем случае не добавляйте к ним префикс 'PUBLIC_', чтобы учетные данные не попали в браузер посетителей.</w:t>
-            </w:r>
-          </w:p>
-          <w:p>
-            <w:pPr>
-              <w:spacing w:before="40" w:after="80"/>
-            </w:pPr>
-            <w:r>
-              <w:rPr>
-                <w:rFonts w:ascii="Calibri" w:hAnsi="Calibri"/>
-                <w:color w:val="1E293B"/>
-                <w:sz w:val="20"/>
-              </w:rPr>
-              <w:t>3. Переменная CONTACT_DIGEST_SECRET обязательна в production (не менее 32 символов). Если она не задана, форма вернет ошибку конфигурации.</w:t>
-            </w:r>
-          </w:p>
-        </w:tc>
-      </w:tr>
-    </w:tbl>
-    <w:p>
-      <w:pPr>
-        <w:spacing w:before="40" w:after="80"/>
-      </w:pPr>
-    </w:p>
-    <w:p>
-      <w:pPr>
-        <w:pStyle w:val="Heading1"/>
-        <w:spacing w:before="280" w:after="120"/>
-      </w:pPr>
       <w:r>
-        <w:t>3. Готовые шаблоны настроек для почтовых сервисов</w:t>
+        <w:t>Не используйте префикс PUBLIC_ для секретов и не сохраняйте значения в .htaccess, репозитории, каталоге релиза, командной строке Cron или логах. Переменные для веб-процесса не гарантированно наследуются Cron: настройте безопасную передачу отдельно. Проверьте доменные SPF, DKIM и DMARC у фактического почтового провайдера.</w:t>
       </w:r>
     </w:p>
     <w:p>
@@ -1417,248 +297,351 @@
         <w:pStyle w:val="Heading2"/>
       </w:pPr>
       <w:r>
-        <w:t>Вариант А: Корпоративная почта домена miracon.gr на хостинге (Рекомендуется)</w:t>
+        <w:t>2. Примеры настроек для почтовых провайдеров</w:t>
+      </w:r>
+    </w:p>
+    <w:p>
+      <w:pPr>
+        <w:pStyle w:val="Heading3"/>
+      </w:pPr>
+      <w:r>
+        <w:t>Вариант 1: Корпоративная почта на хостинге сайта (cPanel / Webmail miracon.gr) — Рекомендуемый</w:t>
       </w:r>
     </w:p>
     <w:p>
       <w:r>
-        <w:t>Если почтовый ящик создан в панели cPanel хостинга (раздел Email Accounts):</w:t>
-      </w:r>
-    </w:p>
-    <w:tbl>
-      <w:tblPr>
-        <w:tblW w:type="auto" w:w="0"/>
-        <w:jc w:val="center"/>
-        <w:tblLayout w:type="fixed"/>
-        <w:tblLook w:firstColumn="1" w:firstRow="1" w:lastColumn="0" w:lastRow="0" w:noHBand="0" w:noVBand="1" w:val="04A0"/>
-      </w:tblPr>
-      <w:tblGrid>
-        <w:gridCol w:w="9360"/>
-      </w:tblGrid>
-      <w:tr>
-        <w:tc>
-          <w:tcPr>
-            <w:tcW w:type="dxa" w:w="9792"/>
-            <w:shd w:fill="F8FAFC"/>
-            <w:tcMar>
-              <w:top w:w="140" w:type="dxa"/>
-              <w:bottom w:w="140" w:type="dxa"/>
-              <w:left w:w="200" w:type="dxa"/>
-              <w:right w:w="200" w:type="dxa"/>
-            </w:tcMar>
-            <w:tcBorders>
-              <w:top w:val="single" w:sz="8" w:space="0" w:color="CBD5E1"/>
-              <w:left w:val="single" w:sz="8" w:space="0" w:color="CBD5E1"/>
-              <w:bottom w:val="single" w:sz="8" w:space="0" w:color="CBD5E1"/>
-              <w:right w:val="single" w:sz="8" w:space="0" w:color="CBD5E1"/>
-              <w:insideH w:val="none"/>
-              <w:insideV w:val="none"/>
-            </w:tcBorders>
-          </w:tcPr>
-          <w:p>
-            <w:pPr>
-              <w:spacing w:before="40" w:after="40" w:line="276" w:lineRule="auto"/>
-            </w:pPr>
-            <w:r>
-              <w:rPr>
-                <w:rFonts w:ascii="Consolas" w:hAnsi="Consolas"/>
-                <w:color w:val="0F172A"/>
-                <w:sz w:val="19"/>
-              </w:rPr>
-              <w:t>CONTACT_SMTP_ENABLED=true</w:t>
-              <w:br/>
-              <w:t>CONTACT_SMTP_HOST=mail.miracon.gr</w:t>
-              <w:br/>
-              <w:t>CONTACT_SMTP_PORT=465</w:t>
-              <w:br/>
-              <w:t>CONTACT_SMTP_USER=info@miracon.gr</w:t>
-              <w:br/>
-              <w:t>CONTACT_SMTP_PASSWORD=Пароль_От_Ящика_В_cPanel</w:t>
-              <w:br/>
-              <w:t>CONTACT_SMTP_FROM=info@miracon.gr</w:t>
-              <w:br/>
-              <w:t>CONTACT_SMTP_TO=info@miracon.gr</w:t>
-              <w:br/>
-              <w:t>CONTACT_DIGEST_SECRET=k9F3mP8xQ2vL7wR4zT6yB1nC5eH8jU0a</w:t>
-            </w:r>
-          </w:p>
-        </w:tc>
-      </w:tr>
-    </w:tbl>
-    <w:p>
-      <w:pPr>
-        <w:spacing w:before="40" w:after="80"/>
-      </w:pPr>
-    </w:p>
-    <w:p>
-      <w:pPr>
-        <w:pStyle w:val="Heading2"/>
-      </w:pPr>
-      <w:r>
-        <w:t>Вариант Б: Google Workspace или ящик Gmail (@gmail.com)</w:t>
+        <w:t>Если почта создана на том же хостинге, где делегирован домен miracon.gr (в cPanel раздел Email Accounts -&gt; info@miracon.gr):</w:t>
       </w:r>
     </w:p>
     <w:p>
       <w:r>
-        <w:t>Google не принимает обычный пароль от аккаунта и требует 16-значный Пароль приложения (App Password):</w:t>
-        <w:br/>
-        <w:t>1. Перейдите в настройки аккаунта Google -&gt; вкладка «Безопасность».</w:t>
-        <w:br/>
-        <w:t>2. Убедитесь, что включена «Двухэтапная аутентификация».</w:t>
-        <w:br/>
-        <w:t>3. Внизу страницы найдите раздел «Пароли приложений».</w:t>
-        <w:br/>
-        <w:t>4. Создайте пароль для «Miracon Website» и скопируйте сгенерированный код:</w:t>
-      </w:r>
-    </w:p>
-    <w:tbl>
-      <w:tblPr>
-        <w:tblW w:type="auto" w:w="0"/>
-        <w:jc w:val="center"/>
-        <w:tblLayout w:type="fixed"/>
-        <w:tblLook w:firstColumn="1" w:firstRow="1" w:lastColumn="0" w:lastRow="0" w:noHBand="0" w:noVBand="1" w:val="04A0"/>
-      </w:tblPr>
-      <w:tblGrid>
-        <w:gridCol w:w="9360"/>
-      </w:tblGrid>
-      <w:tr>
-        <w:tc>
-          <w:tcPr>
-            <w:tcW w:type="dxa" w:w="9792"/>
-            <w:shd w:fill="F8FAFC"/>
-            <w:tcMar>
-              <w:top w:w="140" w:type="dxa"/>
-              <w:bottom w:w="140" w:type="dxa"/>
-              <w:left w:w="200" w:type="dxa"/>
-              <w:right w:w="200" w:type="dxa"/>
-            </w:tcMar>
-            <w:tcBorders>
-              <w:top w:val="single" w:sz="8" w:space="0" w:color="CBD5E1"/>
-              <w:left w:val="single" w:sz="8" w:space="0" w:color="CBD5E1"/>
-              <w:bottom w:val="single" w:sz="8" w:space="0" w:color="CBD5E1"/>
-              <w:right w:val="single" w:sz="8" w:space="0" w:color="CBD5E1"/>
-              <w:insideH w:val="none"/>
-              <w:insideV w:val="none"/>
-            </w:tcBorders>
-          </w:tcPr>
-          <w:p>
-            <w:pPr>
-              <w:spacing w:before="40" w:after="40" w:line="276" w:lineRule="auto"/>
-            </w:pPr>
-            <w:r>
-              <w:rPr>
-                <w:rFonts w:ascii="Consolas" w:hAnsi="Consolas"/>
-                <w:color w:val="0F172A"/>
-                <w:sz w:val="19"/>
-              </w:rPr>
-              <w:t>CONTACT_SMTP_ENABLED=true</w:t>
-              <w:br/>
-              <w:t>CONTACT_SMTP_HOST=smtp.gmail.com</w:t>
-              <w:br/>
-              <w:t>CONTACT_SMTP_PORT=465</w:t>
-              <w:br/>
-              <w:t>CONTACT_SMTP_USER=miracon.greece@gmail.com</w:t>
-              <w:br/>
-              <w:t>CONTACT_SMTP_PASSWORD=abcd efgh ijkl mnop   # (16 букв без пробелов)</w:t>
-              <w:br/>
-              <w:t>CONTACT_SMTP_FROM=miracon.greece@gmail.com</w:t>
-              <w:br/>
-              <w:t>CONTACT_SMTP_TO=info@miracon.gr</w:t>
-              <w:br/>
-              <w:t>CONTACT_DIGEST_SECRET=k9F3mP8xQ2vL7wR4zT6yB1nC5eH8jU0a</w:t>
-            </w:r>
-          </w:p>
-        </w:tc>
-      </w:tr>
-    </w:tbl>
-    <w:p>
-      <w:pPr>
-        <w:spacing w:before="40" w:after="80"/>
-      </w:pPr>
-    </w:p>
-    <w:p>
-      <w:pPr>
-        <w:pStyle w:val="Heading2"/>
-      </w:pPr>
-      <w:r>
-        <w:t>Вариант В: Яндекс 360 / Яндекс Почта</w:t>
+        <w:rPr>
+          <w:rFonts w:ascii="Consolas" w:hAnsi="Consolas"/>
+          <w:sz w:val="18"/>
+        </w:rPr>
+        <w:t>CONTACT_SMTP_ENABLED=true</w:t>
       </w:r>
     </w:p>
     <w:p>
       <w:r>
-        <w:t>В Яндекс ID -&gt; Безопасность -&gt; Пароли приложений создайте пароль типа «Почта»:</w:t>
+        <w:rPr>
+          <w:rFonts w:ascii="Consolas" w:hAnsi="Consolas"/>
+          <w:sz w:val="18"/>
+        </w:rPr>
+        <w:t>CONTACT_SMTP_HOST=mail.miracon.gr</w:t>
       </w:r>
     </w:p>
-    <w:tbl>
-      <w:tblPr>
-        <w:tblW w:type="auto" w:w="0"/>
-        <w:jc w:val="center"/>
-        <w:tblLayout w:type="fixed"/>
-        <w:tblLook w:firstColumn="1" w:firstRow="1" w:lastColumn="0" w:lastRow="0" w:noHBand="0" w:noVBand="1" w:val="04A0"/>
-      </w:tblPr>
-      <w:tblGrid>
-        <w:gridCol w:w="9360"/>
-      </w:tblGrid>
-      <w:tr>
-        <w:tc>
-          <w:tcPr>
-            <w:tcW w:type="dxa" w:w="9792"/>
-            <w:shd w:fill="F8FAFC"/>
-            <w:tcMar>
-              <w:top w:w="140" w:type="dxa"/>
-              <w:bottom w:w="140" w:type="dxa"/>
-              <w:left w:w="200" w:type="dxa"/>
-              <w:right w:w="200" w:type="dxa"/>
-            </w:tcMar>
-            <w:tcBorders>
-              <w:top w:val="single" w:sz="8" w:space="0" w:color="CBD5E1"/>
-              <w:left w:val="single" w:sz="8" w:space="0" w:color="CBD5E1"/>
-              <w:bottom w:val="single" w:sz="8" w:space="0" w:color="CBD5E1"/>
-              <w:right w:val="single" w:sz="8" w:space="0" w:color="CBD5E1"/>
-              <w:insideH w:val="none"/>
-              <w:insideV w:val="none"/>
-            </w:tcBorders>
-          </w:tcPr>
-          <w:p>
-            <w:pPr>
-              <w:spacing w:before="40" w:after="40" w:line="276" w:lineRule="auto"/>
-            </w:pPr>
-            <w:r>
-              <w:rPr>
-                <w:rFonts w:ascii="Consolas" w:hAnsi="Consolas"/>
-                <w:color w:val="0F172A"/>
-                <w:sz w:val="19"/>
-              </w:rPr>
-              <w:t>CONTACT_SMTP_ENABLED=true</w:t>
-              <w:br/>
-              <w:t>CONTACT_SMTP_HOST=smtp.yandex.ru</w:t>
-              <w:br/>
-              <w:t>CONTACT_SMTP_PORT=465</w:t>
-              <w:br/>
-              <w:t>CONTACT_SMTP_USER=info@miracon.gr</w:t>
-              <w:br/>
-              <w:t>CONTACT_SMTP_PASSWORD=пароль_приложения_яндекс</w:t>
-              <w:br/>
-              <w:t>CONTACT_SMTP_FROM=info@miracon.gr</w:t>
-              <w:br/>
-              <w:t>CONTACT_SMTP_TO=info@miracon.gr</w:t>
-            </w:r>
-          </w:p>
-        </w:tc>
-      </w:tr>
-    </w:tbl>
     <w:p>
-      <w:pPr>
-        <w:spacing w:before="40" w:after="80"/>
-      </w:pPr>
+      <w:r>
+        <w:rPr>
+          <w:rFonts w:ascii="Consolas" w:hAnsi="Consolas"/>
+          <w:sz w:val="18"/>
+        </w:rPr>
+        <w:t>CONTACT_SMTP_PORT=465</w:t>
+      </w:r>
+    </w:p>
+    <w:p>
+      <w:r>
+        <w:rPr>
+          <w:rFonts w:ascii="Consolas" w:hAnsi="Consolas"/>
+          <w:sz w:val="18"/>
+        </w:rPr>
+        <w:t>CONTACT_SMTP_USER=info@miracon.gr</w:t>
+      </w:r>
+    </w:p>
+    <w:p>
+      <w:r>
+        <w:rPr>
+          <w:rFonts w:ascii="Consolas" w:hAnsi="Consolas"/>
+          <w:sz w:val="18"/>
+        </w:rPr>
+        <w:t>CONTACT_SMTP_PASSWORD=Ваш_Пароль_От_Почтового_Ящика</w:t>
+      </w:r>
+    </w:p>
+    <w:p>
+      <w:r>
+        <w:rPr>
+          <w:rFonts w:ascii="Consolas" w:hAnsi="Consolas"/>
+          <w:sz w:val="18"/>
+        </w:rPr>
+        <w:t>CONTACT_SMTP_FROM=info@miracon.gr</w:t>
+      </w:r>
+    </w:p>
+    <w:p>
+      <w:r>
+        <w:rPr>
+          <w:rFonts w:ascii="Consolas" w:hAnsi="Consolas"/>
+          <w:sz w:val="18"/>
+        </w:rPr>
+        <w:t>CONTACT_SMTP_TO=info@miracon.gr</w:t>
+      </w:r>
+    </w:p>
+    <w:p>
+      <w:r>
+        <w:t>(Если используется порт `587`, укажите `CONTACT_SMTP_PORT=587`).</w:t>
+      </w:r>
     </w:p>
     <w:p>
       <w:pPr>
-        <w:pStyle w:val="Heading1"/>
-        <w:spacing w:before="280" w:after="120"/>
+        <w:pStyle w:val="Heading3"/>
       </w:pPr>
       <w:r>
-        <w:t>4. Пошаговые инструкции по внесению на сервере</w:t>
+        <w:t>Вариант 2: Google Workspace или личный ящик Gmail (@gmail.com)</w:t>
+      </w:r>
+    </w:p>
+    <w:p>
+      <w:r>
+        <w:t>Google требует обязательную двухфакторную аутентификацию (2FA) и специальный Пароль приложения (обычный пароль от аккаунта Google отклонит):</w:t>
+      </w:r>
+    </w:p>
+    <w:p>
+      <w:r>
+        <w:t>1. Перейдите в аккаунт Google: Безопасность -&gt; Двухэтапная аутентификация (включите, если выключена).</w:t>
+      </w:r>
+    </w:p>
+    <w:p>
+      <w:r>
+        <w:t>2. В самом низу раздела найдите Пароли приложений (App Passwords).</w:t>
+      </w:r>
+    </w:p>
+    <w:p>
+      <w:r>
+        <w:t>3. Создайте пароль с названием, например, Miracon Website, скопируйте сгенерированный 16-значный код (без пробелов).</w:t>
+      </w:r>
+    </w:p>
+    <w:p>
+      <w:r>
+        <w:t>4. Пропишите переменные:</w:t>
+      </w:r>
+    </w:p>
+    <w:p>
+      <w:r>
+        <w:rPr>
+          <w:rFonts w:ascii="Consolas" w:hAnsi="Consolas"/>
+          <w:sz w:val="18"/>
+        </w:rPr>
+        <w:t>CONTACT_SMTP_ENABLED=true</w:t>
+      </w:r>
+    </w:p>
+    <w:p>
+      <w:r>
+        <w:rPr>
+          <w:rFonts w:ascii="Consolas" w:hAnsi="Consolas"/>
+          <w:sz w:val="18"/>
+        </w:rPr>
+        <w:t>CONTACT_SMTP_HOST=smtp.gmail.com</w:t>
+      </w:r>
+    </w:p>
+    <w:p>
+      <w:r>
+        <w:rPr>
+          <w:rFonts w:ascii="Consolas" w:hAnsi="Consolas"/>
+          <w:sz w:val="18"/>
+        </w:rPr>
+        <w:t>CONTACT_SMTP_PORT=465</w:t>
+      </w:r>
+    </w:p>
+    <w:p>
+      <w:r>
+        <w:rPr>
+          <w:rFonts w:ascii="Consolas" w:hAnsi="Consolas"/>
+          <w:sz w:val="18"/>
+        </w:rPr>
+        <w:t>CONTACT_SMTP_USER=ваша_почта@gmail.com</w:t>
+      </w:r>
+    </w:p>
+    <w:p>
+      <w:r>
+        <w:rPr>
+          <w:rFonts w:ascii="Consolas" w:hAnsi="Consolas"/>
+          <w:sz w:val="18"/>
+        </w:rPr>
+        <w:t>CONTACT_SMTP_PASSWORD=шестнадцатизначный_код_приложения</w:t>
+      </w:r>
+    </w:p>
+    <w:p>
+      <w:r>
+        <w:rPr>
+          <w:rFonts w:ascii="Consolas" w:hAnsi="Consolas"/>
+          <w:sz w:val="18"/>
+        </w:rPr>
+        <w:t>CONTACT_SMTP_FROM=ваша_почта@gmail.com</w:t>
+      </w:r>
+    </w:p>
+    <w:p>
+      <w:r>
+        <w:rPr>
+          <w:rFonts w:ascii="Consolas" w:hAnsi="Consolas"/>
+          <w:sz w:val="18"/>
+        </w:rPr>
+        <w:t>CONTACT_SMTP_TO=куда_присылать_заявки@miracon.gr</w:t>
+      </w:r>
+    </w:p>
+    <w:p>
+      <w:pPr>
+        <w:pStyle w:val="Heading3"/>
+      </w:pPr>
+      <w:r>
+        <w:t>Вариант 3: Яндекс 360 / Яндекс Почта (@yandex.ru / на домене)</w:t>
+      </w:r>
+    </w:p>
+    <w:p>
+      <w:r>
+        <w:t>Для Яндекса также требуется «Пароль приложения»:</w:t>
+      </w:r>
+    </w:p>
+    <w:p>
+      <w:r>
+        <w:t>1. Перейдите в Яндекс ID -&gt; Безопасность -&gt; Пароли приложений.</w:t>
+      </w:r>
+    </w:p>
+    <w:p>
+      <w:r>
+        <w:t>2. Создайте пароль для типа «Почта».</w:t>
+      </w:r>
+    </w:p>
+    <w:p>
+      <w:r>
+        <w:t>3. Пропишите переменные:</w:t>
+      </w:r>
+    </w:p>
+    <w:p>
+      <w:r>
+        <w:rPr>
+          <w:rFonts w:ascii="Consolas" w:hAnsi="Consolas"/>
+          <w:sz w:val="18"/>
+        </w:rPr>
+        <w:t>CONTACT_SMTP_ENABLED=true</w:t>
+      </w:r>
+    </w:p>
+    <w:p>
+      <w:r>
+        <w:rPr>
+          <w:rFonts w:ascii="Consolas" w:hAnsi="Consolas"/>
+          <w:sz w:val="18"/>
+        </w:rPr>
+        <w:t>CONTACT_SMTP_HOST=smtp.yandex.ru</w:t>
+      </w:r>
+    </w:p>
+    <w:p>
+      <w:r>
+        <w:rPr>
+          <w:rFonts w:ascii="Consolas" w:hAnsi="Consolas"/>
+          <w:sz w:val="18"/>
+        </w:rPr>
+        <w:t>CONTACT_SMTP_PORT=465</w:t>
+      </w:r>
+    </w:p>
+    <w:p>
+      <w:r>
+        <w:rPr>
+          <w:rFonts w:ascii="Consolas" w:hAnsi="Consolas"/>
+          <w:sz w:val="18"/>
+        </w:rPr>
+        <w:t>CONTACT_SMTP_USER=info@miracon.gr</w:t>
+      </w:r>
+    </w:p>
+    <w:p>
+      <w:r>
+        <w:rPr>
+          <w:rFonts w:ascii="Consolas" w:hAnsi="Consolas"/>
+          <w:sz w:val="18"/>
+        </w:rPr>
+        <w:t>CONTACT_SMTP_PASSWORD=пароль_приложения_яндекс</w:t>
+      </w:r>
+    </w:p>
+    <w:p>
+      <w:r>
+        <w:rPr>
+          <w:rFonts w:ascii="Consolas" w:hAnsi="Consolas"/>
+          <w:sz w:val="18"/>
+        </w:rPr>
+        <w:t>CONTACT_SMTP_FROM=info@miracon.gr</w:t>
+      </w:r>
+    </w:p>
+    <w:p>
+      <w:r>
+        <w:rPr>
+          <w:rFonts w:ascii="Consolas" w:hAnsi="Consolas"/>
+          <w:sz w:val="18"/>
+        </w:rPr>
+        <w:t>CONTACT_SMTP_TO=info@miracon.gr</w:t>
+      </w:r>
+    </w:p>
+    <w:p>
+      <w:pPr>
+        <w:pStyle w:val="Heading3"/>
+      </w:pPr>
+      <w:r>
+        <w:t>Вариант 4: Zoho Mail</w:t>
+      </w:r>
+    </w:p>
+    <w:p>
+      <w:r>
+        <w:rPr>
+          <w:rFonts w:ascii="Consolas" w:hAnsi="Consolas"/>
+          <w:sz w:val="18"/>
+        </w:rPr>
+        <w:t>CONTACT_SMTP_ENABLED=true</w:t>
+      </w:r>
+    </w:p>
+    <w:p>
+      <w:r>
+        <w:rPr>
+          <w:rFonts w:ascii="Consolas" w:hAnsi="Consolas"/>
+          <w:sz w:val="18"/>
+        </w:rPr>
+        <w:t>CONTACT_SMTP_HOST=smtppro.zoho.eu</w:t>
+      </w:r>
+    </w:p>
+    <w:p>
+      <w:r>
+        <w:rPr>
+          <w:rFonts w:ascii="Consolas" w:hAnsi="Consolas"/>
+          <w:sz w:val="18"/>
+        </w:rPr>
+        <w:t>CONTACT_SMTP_PORT=465</w:t>
+      </w:r>
+    </w:p>
+    <w:p>
+      <w:r>
+        <w:rPr>
+          <w:rFonts w:ascii="Consolas" w:hAnsi="Consolas"/>
+          <w:sz w:val="18"/>
+        </w:rPr>
+        <w:t>CONTACT_SMTP_USER=info@miracon.gr</w:t>
+      </w:r>
+    </w:p>
+    <w:p>
+      <w:r>
+        <w:rPr>
+          <w:rFonts w:ascii="Consolas" w:hAnsi="Consolas"/>
+          <w:sz w:val="18"/>
+        </w:rPr>
+        <w:t>CONTACT_SMTP_PASSWORD=пароль_или_app_password</w:t>
+      </w:r>
+    </w:p>
+    <w:p>
+      <w:r>
+        <w:rPr>
+          <w:rFonts w:ascii="Consolas" w:hAnsi="Consolas"/>
+          <w:sz w:val="18"/>
+        </w:rPr>
+        <w:t>CONTACT_SMTP_FROM=info@miracon.gr</w:t>
+      </w:r>
+    </w:p>
+    <w:p>
+      <w:r>
+        <w:rPr>
+          <w:rFonts w:ascii="Consolas" w:hAnsi="Consolas"/>
+          <w:sz w:val="18"/>
+        </w:rPr>
+        <w:t>CONTACT_SMTP_TO=info@miracon.gr</w:t>
+      </w:r>
+    </w:p>
+    <w:p>
+      <w:r>
+        <w:t>(Для серверов в регионе США хост — `smtp.zoho.com`).</w:t>
       </w:r>
     </w:p>
     <w:p>
@@ -1666,24 +649,32 @@
         <w:pStyle w:val="Heading2"/>
       </w:pPr>
       <w:r>
-        <w:t>Сценарий 1: Хостинг с cPanel (Phusion Passenger / Node.js Selector)</w:t>
+        <w:t>3. Развёртывание на cPanel</w:t>
       </w:r>
     </w:p>
     <w:p>
       <w:r>
-        <w:t>1. Откройте панель cPanel хостинга.</w:t>
-        <w:br/>
-        <w:t>2. В блоке Software перейдите в «Setup Node.js App».</w:t>
-        <w:br/>
-        <w:t>3. Найдите в таблице работающее приложение miracon и нажмите кнопку Edit (иконка карандаша).</w:t>
-        <w:br/>
-        <w:t>4. Прокрутите страницу вниз до блока Environment variables (Переменные среды).</w:t>
-        <w:br/>
-        <w:t>5. Нажимая кнопку «Add Variable», поочередно внесите все переменные (CONTACT_SMTP_*).</w:t>
-        <w:br/>
-        <w:t>6. В верхней части страницы нажмите кнопку «Save».</w:t>
-        <w:br/>
-        <w:t>7. Нажмите кнопку «Restart», чтобы Node.js перечитал обновленные переменные окружения.</w:t>
+        <w:t>1. В Setup Node.js App поместите переменные сайта в защищённую конфигурацию Passenger вне public_html и каталога релиза. Создайте отдельный источник переменных Cron с правами 0600 вне этих каталогов или используйте защищённое окружение хостинга; убедитесь, что обе среды содержат актуальные значения. Не кладите .env рядом с app.js в развёрнутый релиз.</w:t>
+      </w:r>
+    </w:p>
+    <w:p>
+      <w:r>
+        <w:t>2. Примените миграции npm run postgres:migrate перед запуском нового приложения и worker. Установите production-зависимости (npm ci --omit=dev) для целевого Node 22; перезапустите Passenger и проверьте GET /api/health.</w:t>
+      </w:r>
+    </w:p>
+    <w:p>
+      <w:r>
+        <w:t>3. Выполните из текущего релиза npm run contact:mail:drain без --apply: это сухой просмотр количества заданий без SMTP-отправки. Настройте минутный Cron node scripts/contact-mail-drain.mjs --apply с абсолютными путями к Node и релизу, отдельным flock, закрытым логом и уведомлением об ошибочном коде завершения. Не рассчитывайте на PATH или переменные интерактивной оболочки в Cron.</w:t>
+      </w:r>
+    </w:p>
+    <w:p>
+      <w:r>
+        <w:t>4. Проверьте сначала внутренний ящик на одной контролируемой заявке. Для автоответа установите CONTACT_AUTOREPLY_ENABLED=true, перезапустите приложение, отправьте одну EN и одну EL заявку на свой адрес и запустите worker; после успешной проверки разрешайте опцию для посетителей. Оставляйте возможность ответить на CONTACT_SMTP_FROM живому менеджеру.</w:t>
+      </w:r>
+    </w:p>
+    <w:p>
+      <w:r>
+        <w:t>5. После переключения и проверки работы формы и worker смените оба ранее публичных секрета в защищённой конфигурации и повторите проверку. Используйте контрольный список в docs/production-release-runbook.md.</w:t>
       </w:r>
     </w:p>
     <w:p>
@@ -1691,20 +682,27 @@
         <w:pStyle w:val="Heading2"/>
       </w:pPr>
       <w:r>
-        <w:t>Сценарий 2: Платформа Render.com (если сайт/превью запущены на Render)</w:t>
+        <w:t>4. Состав писем и гарантии доставки</w:t>
       </w:r>
     </w:p>
     <w:p>
       <w:r>
-        <w:t>1. Откройте панель управления dashboard.render.com.</w:t>
-        <w:br/>
-        <w:t>2. Выберите веб-сервис miracon.</w:t>
-        <w:br/>
-        <w:t>3. В левом боковом меню перейдите на вкладку «Environment».</w:t>
-        <w:br/>
-        <w:t>4. Нажмите «Add Environment Variable» и внесите необходимые переменные.</w:t>
-        <w:br/>
-        <w:t>5. Нажмите кнопку «Save Changes». Сервис автоматически выполнит перезапуск.</w:t>
+        <w:t>Уведомление приходит на CONTACT_SMTP_TO: ID заявки, время приёма, язык, источник, имя, контактные данные и сообщение. Reply-To указывает на проверенный email посетителя при его наличии. Сырые IP-адреса, защитные хеши и SMTP-секреты не включаются в письмо.</w:t>
+      </w:r>
+    </w:p>
+    <w:p>
+      <w:r>
+        <w:t>Автоответ ставится в очередь только после приёма заявки с согласием и корректным email, если CONTACT_AUTOREPLY_ENABLED=true. Текст на английском или греческом кратко подтверждает получение; ни сообщение, ни телефон, ни персональные данные заявителя не дублируются. На один email без учёта регистра отправляется не более одного автоответа в скользящие 24 часа.</w:t>
+      </w:r>
+    </w:p>
+    <w:p>
+      <w:r>
+        <w:t>Worker арендует задания из miracon.contact_mail_jobs, при ошибках делает до десяти попыток с задержкой от минуты до часа. Просроченные автоответы после 24 часов и внутренние уведомления после семи дней переходят в dead; не отправляйте их вручную посетителям без проверки. Перезапуск worker после принятия SMTP, но до записи результата, может дать повторное письмо: гарантируется at-least-once, не exactly-once. Ответ сайта не зависит от доступности SMTP.</w:t>
+      </w:r>
+    </w:p>
+    <w:p>
+      <w:r>
+        <w:t>Наблюдайте за кодом завершения Cron, числом просроченных queued/dead, категориями ошибок и задержкой доставки. Логи не должны содержать персональные данные, текст заявки, пароли и сообщения SMTP-провайдера. Проверьте папку «Спам» и записи SPF/DKIM/DMARC. Ошибки авторизации устраняйте в защищённых настройках, а ошибки TLS — корректным именем и сертификатом сервера, не отключением проверки сертификата.</w:t>
       </w:r>
     </w:p>
     <w:p>
@@ -1712,430 +710,97 @@
         <w:pStyle w:val="Heading2"/>
       </w:pPr>
       <w:r>
-        <w:t>Сценарий 3: Выделенный VPS Linux сервер (через .env)</w:t>
+        <w:t>5. Проверка ранее накопленных заявок</w:t>
       </w:r>
     </w:p>
     <w:p>
       <w:r>
-        <w:t>1. Подключитесь по SSH к серверу.</w:t>
-        <w:br/>
-        <w:t>2. Откройте файл .env в каталоге приложения (nano /var/www/miracon/.env).</w:t>
-        <w:br/>
-        <w:t>3. Добавьте строки с параметрами CONTACT_SMTP_* и сохраните файл.</w:t>
-        <w:br/>
-        <w:t>4. Перезапустите службу Node.js: sudo systemctl restart miracon (или pm2 restart miracon).</w:t>
-      </w:r>
-    </w:p>
-    <w:p>
-      <w:pPr>
-        <w:pStyle w:val="Heading1"/>
-        <w:spacing w:before="280" w:after="120"/>
-      </w:pPr>
-      <w:r>
-        <w:t>5. Как выглядит входящее письмо и удобство ответа</w:t>
-      </w:r>
-    </w:p>
-    <w:p>
-      <w:r>
-        <w:t xml:space="preserve">При отправке заявки на почту </w:t>
-      </w:r>
-      <w:r>
-        <w:rPr>
-          <w:rFonts w:ascii="Consolas" w:hAnsi="Consolas"/>
-        </w:rPr>
-        <w:t>CONTACT_SMTP_TO</w:t>
-      </w:r>
-      <w:r>
-        <w:t xml:space="preserve"> поступает структурированное письмо следующего вида:</w:t>
-      </w:r>
-    </w:p>
-    <w:tbl>
-      <w:tblPr>
-        <w:tblW w:type="auto" w:w="0"/>
-        <w:jc w:val="center"/>
-        <w:tblLayout w:type="fixed"/>
-        <w:tblLook w:firstColumn="1" w:firstRow="1" w:lastColumn="0" w:lastRow="0" w:noHBand="0" w:noVBand="1" w:val="04A0"/>
-      </w:tblPr>
-      <w:tblGrid>
-        <w:gridCol w:w="9360"/>
-      </w:tblGrid>
-      <w:tr>
-        <w:tc>
-          <w:tcPr>
-            <w:tcW w:type="dxa" w:w="9792"/>
-            <w:shd w:fill="F8FAFC"/>
-            <w:tcMar>
-              <w:top w:w="140" w:type="dxa"/>
-              <w:bottom w:w="140" w:type="dxa"/>
-              <w:left w:w="200" w:type="dxa"/>
-              <w:right w:w="200" w:type="dxa"/>
-            </w:tcMar>
-            <w:tcBorders>
-              <w:top w:val="single" w:sz="8" w:space="0" w:color="CBD5E1"/>
-              <w:left w:val="single" w:sz="8" w:space="0" w:color="CBD5E1"/>
-              <w:bottom w:val="single" w:sz="8" w:space="0" w:color="CBD5E1"/>
-              <w:right w:val="single" w:sz="8" w:space="0" w:color="CBD5E1"/>
-              <w:insideH w:val="none"/>
-              <w:insideV w:val="none"/>
-            </w:tcBorders>
-          </w:tcPr>
-          <w:p>
-            <w:pPr>
-              <w:spacing w:before="40" w:after="40" w:line="276" w:lineRule="auto"/>
-            </w:pPr>
-            <w:r>
-              <w:rPr>
-                <w:rFonts w:ascii="Consolas" w:hAnsi="Consolas"/>
-                <w:color w:val="0F172A"/>
-                <w:sz w:val="19"/>
-              </w:rPr>
-              <w:t>Тема: New contact submission 7c9e6679-7425-40de-944b-e07fc1f90ae7</w:t>
-              <w:br/>
-              <w:t>От: info@miracon.gr</w:t>
-              <w:br/>
-              <w:t>Кому: info@miracon.gr</w:t>
-              <w:br/>
-              <w:t>Reply-To: client@example.com   &lt;-- Email клиента, заполнившего форму</w:t>
-              <w:br/>
-              <w:br/>
-              <w:t>Contact ID: 7c9e6679-7425-40de-944b-e07fc1f90ae7</w:t>
-              <w:br/>
-              <w:t>Accepted at: 2026-09-17T10:15:30.123Z</w:t>
-              <w:br/>
-              <w:t>Locale: el</w:t>
-              <w:br/>
-              <w:t>Source: /el/#contacts</w:t>
-              <w:br/>
-              <w:t>Name: Konstantinos Papadopoulos</w:t>
-              <w:br/>
-              <w:t>Email: client@example.com</w:t>
-              <w:br/>
-              <w:t>Phone: +30 695 000 0000</w:t>
-              <w:br/>
-              <w:br/>
-              <w:t>Message:</w:t>
-              <w:br/>
-              <w:t>Γεια σας, ενδιαφέρομαι για το έργο Panorama Luxury Residences. Θα ήθελα περισσότερες πληροφορίες.</w:t>
-            </w:r>
-          </w:p>
-        </w:tc>
-      </w:tr>
-    </w:tbl>
-    <w:p>
-      <w:pPr>
-        <w:spacing w:before="40" w:after="80"/>
-      </w:pPr>
-    </w:p>
-    <w:tbl>
-      <w:tblPr>
-        <w:tblW w:type="auto" w:w="0"/>
-        <w:jc w:val="center"/>
-        <w:tblLayout w:type="fixed"/>
-        <w:tblLook w:firstColumn="1" w:firstRow="1" w:lastColumn="0" w:lastRow="0" w:noHBand="0" w:noVBand="1" w:val="04A0"/>
-      </w:tblPr>
-      <w:tblGrid>
-        <w:gridCol w:w="9360"/>
-      </w:tblGrid>
-      <w:tr>
-        <w:tc>
-          <w:tcPr>
-            <w:tcW w:type="dxa" w:w="9792"/>
-            <w:shd w:fill="EFF6FF"/>
-            <w:tcMar>
-              <w:top w:w="160" w:type="dxa"/>
-              <w:bottom w:w="160" w:type="dxa"/>
-              <w:left w:w="240" w:type="dxa"/>
-              <w:right w:w="200" w:type="dxa"/>
-            </w:tcMar>
-            <w:tcBorders>
-              <w:top w:val="none" w:sz="4" w:space="0" w:color="auto"/>
-              <w:left w:val="single" w:sz="24" w:space="0" w:color="2563EB"/>
-              <w:bottom w:val="none" w:sz="4" w:space="0" w:color="auto"/>
-              <w:right w:val="none" w:sz="4" w:space="0" w:color="auto"/>
-              <w:insideH w:val="none"/>
-              <w:insideV w:val="none"/>
-            </w:tcBorders>
-          </w:tcPr>
-          <w:p>
-            <w:pPr>
-              <w:spacing w:before="40" w:after="80"/>
-            </w:pPr>
-            <w:r>
-              <w:rPr>
-                <w:rFonts w:ascii="Calibri" w:hAnsi="Calibri"/>
-                <w:b/>
-                <w:color w:val="1E40AF"/>
-                <w:sz w:val="21"/>
-              </w:rPr>
-              <w:t>📌 УДОБСТВО ДЛЯ ОТДЕЛА ПРОДАЖ</w:t>
-              <w:br/>
-            </w:r>
-            <w:r>
-              <w:rPr>
-                <w:rFonts w:ascii="Calibri" w:hAnsi="Calibri"/>
-                <w:color w:val="1E293B"/>
-                <w:sz w:val="20"/>
-              </w:rPr>
-              <w:t>В поле 'Reply-To' письма автоматически подставляется email, который указал посетитель сайта. Менеджеру достаточно нажать кнопку «Ответить» в своей почтовой программе (Outlook, Gmail, Thunderbird и др.), и ответ немедленно уйдет клиенту на его личную почту.</w:t>
-            </w:r>
-          </w:p>
-        </w:tc>
-      </w:tr>
-    </w:tbl>
-    <w:p>
-      <w:pPr>
-        <w:spacing w:before="40" w:after="80"/>
-      </w:pPr>
-    </w:p>
-    <w:p>
-      <w:pPr>
-        <w:pStyle w:val="Heading1"/>
-        <w:spacing w:before="280" w:after="120"/>
-      </w:pPr>
-      <w:r>
-        <w:t>6. Инструкция по проверке и тестированию</w:t>
-      </w:r>
-    </w:p>
-    <w:p>
-      <w:r>
-        <w:t xml:space="preserve">1. Откройте сайт </w:t>
-      </w:r>
-      <w:r>
-        <w:rPr>
-          <w:rFonts w:ascii="Consolas" w:hAnsi="Consolas"/>
-        </w:rPr>
-        <w:t>https://miracon.gr/#contacts</w:t>
-      </w:r>
-      <w:r>
-        <w:t xml:space="preserve"> (или тестовый адрес).</w:t>
-        <w:br/>
-        <w:t>2. Заполните форму тестовыми данными:</w:t>
-        <w:br/>
-        <w:t xml:space="preserve">   • Имя: Тестовая Проверка Почты</w:t>
-        <w:br/>
-        <w:t xml:space="preserve">   • Телефон: +30 690 000 0000</w:t>
-        <w:br/>
-        <w:t xml:space="preserve">   • Email: ваш рабочий или личный email</w:t>
-        <w:br/>
-        <w:t xml:space="preserve">   • Сообщение: Тестовое сообщение для проверки SMTP</w:t>
-        <w:br/>
-        <w:t xml:space="preserve">   • Чекбокс согласия с политикой конфиденциальности: отмечен</w:t>
-        <w:br/>
-        <w:t>3. Нажмите кнопку «Отправить».</w:t>
-        <w:br/>
-        <w:t>4. Откройте почтовый ящик, указанный в CONTACT_SMTP_TO, и проверьте входящие.</w:t>
-        <w:br/>
-        <w:t>5. Если письма нет во «Входящих», проверьте папку «Спам» (Junk) и отметьте его как «Не спам».</w:t>
-      </w:r>
-    </w:p>
-    <w:p>
-      <w:pPr>
-        <w:pStyle w:val="Heading1"/>
-        <w:spacing w:before="280" w:after="120"/>
-      </w:pPr>
-      <w:r>
-        <w:t>7. Как выгрузить заявки, накопившиеся в базе данных</w:t>
-      </w:r>
-    </w:p>
-    <w:p>
-      <w:r>
-        <w:t xml:space="preserve">Все заявки, отправленные до настройки почты, сохранены в таблице </w:t>
-      </w:r>
-      <w:r>
-        <w:rPr>
-          <w:rFonts w:ascii="Consolas" w:hAnsi="Consolas"/>
-        </w:rPr>
-        <w:t>miracon.contacts</w:t>
-      </w:r>
-      <w:r>
-        <w:t>. Их можно выгрузить следующими способами:</w:t>
+        <w:t>Заявки, принятые до установки этой миграции, остаются в miracon.contact_submissions и доступны в защищённом интерфейсе администратора и CSV-экспорте. Старые письма автоматически не создаются. Если нужно сверить очередь после миграции, оператор выполняет SQL через защищённое подключение, не на публичном сайте:</w:t>
       </w:r>
     </w:p>
     <w:p>
       <w:r>
         <w:rPr>
-          <w:b/>
+          <w:rFonts w:ascii="Consolas" w:hAnsi="Consolas"/>
+          <w:sz w:val="18"/>
         </w:rPr>
-        <w:t>Способ 1: Прямой SQL-запрос (через psql или любой SQL-клиент):</w:t>
+        <w:t>SELECT kind, state, count(*)</w:t>
+      </w:r>
+    </w:p>
+    <w:p>
+      <w:r>
+        <w:rPr>
+          <w:rFonts w:ascii="Consolas" w:hAnsi="Consolas"/>
+          <w:sz w:val="18"/>
+        </w:rPr>
+        <w:t>FROM miracon.contact_mail_jobs</w:t>
+      </w:r>
+    </w:p>
+    <w:p>
+      <w:r>
+        <w:rPr>
+          <w:rFonts w:ascii="Consolas" w:hAnsi="Consolas"/>
+          <w:sz w:val="18"/>
+        </w:rPr>
+        <w:t>GROUP BY kind, state</w:t>
+      </w:r>
+    </w:p>
+    <w:p>
+      <w:r>
+        <w:rPr>
+          <w:rFonts w:ascii="Consolas" w:hAnsi="Consolas"/>
+          <w:sz w:val="18"/>
+        </w:rPr>
+        <w:t>ORDER BY kind, state;</w:t>
+      </w:r>
+    </w:p>
+    <w:p>
+      <w:pPr>
+        <w:pStyle w:val="Heading2"/>
+      </w:pPr>
+      <w:r>
+        <w:t>6. Диагностика</w:t>
       </w:r>
     </w:p>
     <w:tbl>
       <w:tblPr>
+        <w:tblStyle w:val="LightShading-Accent1"/>
         <w:tblW w:type="auto" w:w="0"/>
         <w:jc w:val="center"/>
-        <w:tblLayout w:type="fixed"/>
         <w:tblLook w:firstColumn="1" w:firstRow="1" w:lastColumn="0" w:lastRow="0" w:noHBand="0" w:noVBand="1" w:val="04A0"/>
       </w:tblPr>
       <w:tblGrid>
-        <w:gridCol w:w="9360"/>
+        <w:gridCol w:w="2880"/>
+        <w:gridCol w:w="2880"/>
+        <w:gridCol w:w="2880"/>
       </w:tblGrid>
       <w:tr>
         <w:tc>
           <w:tcPr>
-            <w:tcW w:type="dxa" w:w="9792"/>
-            <w:shd w:fill="F8FAFC"/>
-            <w:tcMar>
-              <w:top w:w="140" w:type="dxa"/>
-              <w:bottom w:w="140" w:type="dxa"/>
-              <w:left w:w="200" w:type="dxa"/>
-              <w:right w:w="200" w:type="dxa"/>
-            </w:tcMar>
-            <w:tcBorders>
-              <w:top w:val="single" w:sz="8" w:space="0" w:color="CBD5E1"/>
-              <w:left w:val="single" w:sz="8" w:space="0" w:color="CBD5E1"/>
-              <w:bottom w:val="single" w:sz="8" w:space="0" w:color="CBD5E1"/>
-              <w:right w:val="single" w:sz="8" w:space="0" w:color="CBD5E1"/>
-              <w:insideH w:val="none"/>
-              <w:insideV w:val="none"/>
-            </w:tcBorders>
-          </w:tcPr>
-          <w:p>
-            <w:pPr>
-              <w:spacing w:before="40" w:after="40" w:line="276" w:lineRule="auto"/>
-            </w:pPr>
-            <w:r>
-              <w:rPr>
-                <w:rFonts w:ascii="Consolas" w:hAnsi="Consolas"/>
-                <w:color w:val="0F172A"/>
-                <w:sz w:val="19"/>
-              </w:rPr>
-              <w:t xml:space="preserve">SELECT </w:t>
-              <w:br/>
-              <w:t xml:space="preserve">    id, </w:t>
-              <w:br/>
-              <w:t xml:space="preserve">    created_at AS date_time,</w:t>
-              <w:br/>
-              <w:t xml:space="preserve">    locale,</w:t>
-              <w:br/>
-              <w:t xml:space="preserve">    name,</w:t>
-              <w:br/>
-              <w:t xml:space="preserve">    email,</w:t>
-              <w:br/>
-              <w:t xml:space="preserve">    phone,</w:t>
-              <w:br/>
-              <w:t xml:space="preserve">    message,</w:t>
-              <w:br/>
-              <w:t xml:space="preserve">    source_path</w:t>
-              <w:br/>
-              <w:t>FROM miracon.contacts</w:t>
-              <w:br/>
-              <w:t>ORDER BY created_at DESC;</w:t>
-            </w:r>
-          </w:p>
-        </w:tc>
-      </w:tr>
-    </w:tbl>
-    <w:p>
-      <w:pPr>
-        <w:spacing w:before="40" w:after="80"/>
-      </w:pPr>
-    </w:p>
-    <w:p>
-      <w:r>
-        <w:rPr>
-          <w:b/>
-        </w:rPr>
-        <w:t>Способ 2: Через интерфейс phpPgAdmin в cPanel:</w:t>
-      </w:r>
-    </w:p>
-    <w:p>
-      <w:r>
-        <w:t>1. В cPanel откройте раздел Databases -&gt; phpPgAdmin.</w:t>
-        <w:br/>
-        <w:t>2. Выберите базу данных miracon -&gt; схема miracon -&gt; раздел Tables (Таблицы).</w:t>
-        <w:br/>
-        <w:t>3. Нажмите кнопку «Browse» (Обзор) напротив таблицы contacts.</w:t>
-        <w:br/>
-        <w:t>4. При необходимости нажмите кнопку «Export» для выгрузки данных в формате CSV или Excel.</w:t>
-      </w:r>
-    </w:p>
-    <w:p>
-      <w:pPr>
-        <w:pStyle w:val="Heading1"/>
-        <w:spacing w:before="280" w:after="120"/>
-      </w:pPr>
-      <w:r>
-        <w:t>8. Возможные проблемы и их решение (Troubleshooting)</w:t>
-      </w:r>
-    </w:p>
-    <w:tbl>
-      <w:tblPr>
-        <w:tblW w:type="auto" w:w="0"/>
-        <w:jc w:val="center"/>
-        <w:tblLayout w:type="fixed"/>
-        <w:tblLook w:firstColumn="1" w:firstRow="1" w:lastColumn="0" w:lastRow="0" w:noHBand="0" w:noVBand="1" w:val="04A0"/>
-      </w:tblPr>
-      <w:tblGrid>
-        <w:gridCol w:w="2592"/>
-        <w:gridCol w:w="2880"/>
-        <w:gridCol w:w="3888"/>
-      </w:tblGrid>
-      <w:tr>
-        <w:tc>
-          <w:tcPr>
-            <w:tcW w:type="dxa" w:w="3264"/>
-            <w:shd w:fill="1E293B"/>
-            <w:tcMar>
-              <w:top w:w="120" w:type="dxa"/>
-              <w:bottom w:w="120" w:type="dxa"/>
-              <w:left w:w="140" w:type="dxa"/>
-              <w:right w:w="140" w:type="dxa"/>
-            </w:tcMar>
+            <w:tcW w:type="dxa" w:w="2880"/>
           </w:tcPr>
           <w:p>
             <w:r>
-              <w:rPr>
-                <w:rFonts w:ascii="Calibri" w:hAnsi="Calibri"/>
-                <w:b/>
-                <w:color w:val="FFFFFF"/>
-                <w:sz w:val="20"/>
-              </w:rPr>
               <w:t>Симптом / Ошибка</w:t>
             </w:r>
           </w:p>
         </w:tc>
         <w:tc>
           <w:tcPr>
-            <w:tcW w:type="dxa" w:w="3264"/>
-            <w:shd w:fill="1E293B"/>
-            <w:tcMar>
-              <w:top w:w="120" w:type="dxa"/>
-              <w:bottom w:w="120" w:type="dxa"/>
-              <w:left w:w="140" w:type="dxa"/>
-              <w:right w:w="140" w:type="dxa"/>
-            </w:tcMar>
+            <w:tcW w:type="dxa" w:w="2880"/>
           </w:tcPr>
           <w:p>
             <w:r>
-              <w:rPr>
-                <w:rFonts w:ascii="Calibri" w:hAnsi="Calibri"/>
-                <w:b/>
-                <w:color w:val="FFFFFF"/>
-                <w:sz w:val="20"/>
-              </w:rPr>
               <w:t>Причина</w:t>
             </w:r>
           </w:p>
         </w:tc>
         <w:tc>
           <w:tcPr>
-            <w:tcW w:type="dxa" w:w="3264"/>
-            <w:shd w:fill="1E293B"/>
-            <w:tcMar>
-              <w:top w:w="120" w:type="dxa"/>
-              <w:bottom w:w="120" w:type="dxa"/>
-              <w:left w:w="140" w:type="dxa"/>
-              <w:right w:w="140" w:type="dxa"/>
-            </w:tcMar>
+            <w:tcW w:type="dxa" w:w="2880"/>
           </w:tcPr>
           <w:p>
             <w:r>
-              <w:rPr>
-                <w:rFonts w:ascii="Calibri" w:hAnsi="Calibri"/>
-                <w:b/>
-                <w:color w:val="FFFFFF"/>
-                <w:sz w:val="20"/>
-              </w:rPr>
               <w:t>Способ решения</w:t>
             </w:r>
           </w:p>
@@ -2144,31 +809,10 @@
       <w:tr>
         <w:tc>
           <w:tcPr>
-            <w:tcW w:type="dxa" w:w="2592"/>
-            <w:shd w:fill="FFFFFF"/>
-            <w:tcMar>
-              <w:top w:w="100" w:type="dxa"/>
-              <w:bottom w:w="100" w:type="dxa"/>
-              <w:left w:w="120" w:type="dxa"/>
-              <w:right w:w="120" w:type="dxa"/>
-            </w:tcMar>
-            <w:tcBorders>
-              <w:top w:val="none" w:sz="4" w:space="0" w:color="auto"/>
-              <w:left w:val="none" w:sz="4" w:space="0" w:color="auto"/>
-              <w:bottom w:val="single" w:sz="4" w:space="0" w:color="E2E8F0"/>
-              <w:right w:val="none" w:sz="4" w:space="0" w:color="auto"/>
-              <w:insideH w:val="none"/>
-              <w:insideV w:val="none"/>
-            </w:tcBorders>
+            <w:tcW w:type="dxa" w:w="2880"/>
           </w:tcPr>
           <w:p>
             <w:r>
-              <w:rPr>
-                <w:rFonts w:ascii="Calibri" w:hAnsi="Calibri"/>
-                <w:b/>
-                <w:color w:val="0F172A"/>
-                <w:sz w:val="19"/>
-              </w:rPr>
               <w:t>Invalid login / 535 Authentication failed</w:t>
             </w:r>
           </w:p>
@@ -2176,60 +820,20 @@
         <w:tc>
           <w:tcPr>
             <w:tcW w:type="dxa" w:w="2880"/>
-            <w:shd w:fill="FFFFFF"/>
-            <w:tcMar>
-              <w:top w:w="100" w:type="dxa"/>
-              <w:bottom w:w="100" w:type="dxa"/>
-              <w:left w:w="120" w:type="dxa"/>
-              <w:right w:w="120" w:type="dxa"/>
-            </w:tcMar>
-            <w:tcBorders>
-              <w:top w:val="none" w:sz="4" w:space="0" w:color="auto"/>
-              <w:left w:val="none" w:sz="4" w:space="0" w:color="auto"/>
-              <w:bottom w:val="single" w:sz="4" w:space="0" w:color="E2E8F0"/>
-              <w:right w:val="none" w:sz="4" w:space="0" w:color="auto"/>
-              <w:insideH w:val="none"/>
-              <w:insideV w:val="none"/>
-            </w:tcBorders>
           </w:tcPr>
           <w:p>
             <w:r>
-              <w:rPr>
-                <w:rFonts w:ascii="Calibri" w:hAnsi="Calibri"/>
-                <w:color w:val="334155"/>
-                <w:sz w:val="19"/>
-              </w:rPr>
-              <w:t>Неверный логин/пароль или почта требует пароль приложения.</w:t>
+              <w:t>Неверный логин/пароль или почтовый провайдер требует пароль приложения.</w:t>
             </w:r>
           </w:p>
         </w:tc>
         <w:tc>
           <w:tcPr>
-            <w:tcW w:type="dxa" w:w="3888"/>
-            <w:shd w:fill="FFFFFF"/>
-            <w:tcMar>
-              <w:top w:w="100" w:type="dxa"/>
-              <w:bottom w:w="100" w:type="dxa"/>
-              <w:left w:w="120" w:type="dxa"/>
-              <w:right w:w="120" w:type="dxa"/>
-            </w:tcMar>
-            <w:tcBorders>
-              <w:top w:val="none" w:sz="4" w:space="0" w:color="auto"/>
-              <w:left w:val="none" w:sz="4" w:space="0" w:color="auto"/>
-              <w:bottom w:val="single" w:sz="4" w:space="0" w:color="E2E8F0"/>
-              <w:right w:val="none" w:sz="4" w:space="0" w:color="auto"/>
-              <w:insideH w:val="none"/>
-              <w:insideV w:val="none"/>
-            </w:tcBorders>
+            <w:tcW w:type="dxa" w:w="2880"/>
           </w:tcPr>
           <w:p>
             <w:r>
-              <w:rPr>
-                <w:rFonts w:ascii="Calibri" w:hAnsi="Calibri"/>
-                <w:color w:val="334155"/>
-                <w:sz w:val="19"/>
-              </w:rPr>
-              <w:t>Проверьте правильность CONTACT_SMTP_USER и PASSWORD. Для Gmail/Яндекс сгенерируйте Пароль приложения в безопасности аккаунта.</w:t>
+              <w:t>Проверьте CONTACT_SMTP_USER и CONTACT_SMTP_PASSWORD. Для Gmail, Яндекс, Mail.ru создайте отдельный «Пароль приложения» в настройках безопасности аккаунта.</w:t>
             </w:r>
           </w:p>
         </w:tc>
@@ -2237,92 +841,31 @@
       <w:tr>
         <w:tc>
           <w:tcPr>
-            <w:tcW w:type="dxa" w:w="2592"/>
-            <w:shd w:fill="F8FAFC"/>
-            <w:tcMar>
-              <w:top w:w="100" w:type="dxa"/>
-              <w:bottom w:w="100" w:type="dxa"/>
-              <w:left w:w="120" w:type="dxa"/>
-              <w:right w:w="120" w:type="dxa"/>
-            </w:tcMar>
-            <w:tcBorders>
-              <w:top w:val="none" w:sz="4" w:space="0" w:color="auto"/>
-              <w:left w:val="none" w:sz="4" w:space="0" w:color="auto"/>
-              <w:bottom w:val="single" w:sz="4" w:space="0" w:color="E2E8F0"/>
-              <w:right w:val="none" w:sz="4" w:space="0" w:color="auto"/>
-              <w:insideH w:val="none"/>
-              <w:insideV w:val="none"/>
-            </w:tcBorders>
+            <w:tcW w:type="dxa" w:w="2880"/>
           </w:tcPr>
           <w:p>
             <w:r>
-              <w:rPr>
-                <w:rFonts w:ascii="Calibri" w:hAnsi="Calibri"/>
-                <w:b/>
-                <w:color w:val="0F172A"/>
-                <w:sz w:val="19"/>
-              </w:rPr>
-              <w:t>Connection timeout (ETIMEDOUT) на портах 465/587</w:t>
+              <w:t>Connection timed out (ETIMEDOUT) на порту 465 / 587</w:t>
             </w:r>
           </w:p>
         </w:tc>
         <w:tc>
           <w:tcPr>
             <w:tcW w:type="dxa" w:w="2880"/>
-            <w:shd w:fill="F8FAFC"/>
-            <w:tcMar>
-              <w:top w:w="100" w:type="dxa"/>
-              <w:bottom w:w="100" w:type="dxa"/>
-              <w:left w:w="120" w:type="dxa"/>
-              <w:right w:w="120" w:type="dxa"/>
-            </w:tcMar>
-            <w:tcBorders>
-              <w:top w:val="none" w:sz="4" w:space="0" w:color="auto"/>
-              <w:left w:val="none" w:sz="4" w:space="0" w:color="auto"/>
-              <w:bottom w:val="single" w:sz="4" w:space="0" w:color="E2E8F0"/>
-              <w:right w:val="none" w:sz="4" w:space="0" w:color="auto"/>
-              <w:insideH w:val="none"/>
-              <w:insideV w:val="none"/>
-            </w:tcBorders>
           </w:tcPr>
           <w:p>
             <w:r>
-              <w:rPr>
-                <w:rFonts w:ascii="Calibri" w:hAnsi="Calibri"/>
-                <w:color w:val="334155"/>
-                <w:sz w:val="19"/>
-              </w:rPr>
-              <w:t>Хостинг блокирует исходящий почтовый трафик файрволом.</w:t>
+              <w:t>Хостинг блокирует исходящие SMTP-соединения на уровне файрвола.</w:t>
             </w:r>
           </w:p>
         </w:tc>
         <w:tc>
           <w:tcPr>
-            <w:tcW w:type="dxa" w:w="3888"/>
-            <w:shd w:fill="F8FAFC"/>
-            <w:tcMar>
-              <w:top w:w="100" w:type="dxa"/>
-              <w:bottom w:w="100" w:type="dxa"/>
-              <w:left w:w="120" w:type="dxa"/>
-              <w:right w:w="120" w:type="dxa"/>
-            </w:tcMar>
-            <w:tcBorders>
-              <w:top w:val="none" w:sz="4" w:space="0" w:color="auto"/>
-              <w:left w:val="none" w:sz="4" w:space="0" w:color="auto"/>
-              <w:bottom w:val="single" w:sz="4" w:space="0" w:color="E2E8F0"/>
-              <w:right w:val="none" w:sz="4" w:space="0" w:color="auto"/>
-              <w:insideH w:val="none"/>
-              <w:insideV w:val="none"/>
-            </w:tcBorders>
+            <w:tcW w:type="dxa" w:w="2880"/>
           </w:tcPr>
           <w:p>
             <w:r>
-              <w:rPr>
-                <w:rFonts w:ascii="Calibri" w:hAnsi="Calibri"/>
-                <w:color w:val="334155"/>
-                <w:sz w:val="19"/>
-              </w:rPr>
-              <w:t>Напишите в техподдержку хостинга: «Прошу открыть исходящие SMTP порты 465 и 587 для отправки почты через внешние сервера».</w:t>
+              <w:t>На некоторых shared-хостингах исходящий SMTP во внешний мир закрыт по умолчанию. Напишите в техподдержку хостинга: «Прошу открыть исходящие SMTP-порты 465 и 587 для подключения к внешним почтовым серверам».</w:t>
             </w:r>
           </w:p>
         </w:tc>
@@ -2330,92 +873,31 @@
       <w:tr>
         <w:tc>
           <w:tcPr>
-            <w:tcW w:type="dxa" w:w="2592"/>
-            <w:shd w:fill="FFFFFF"/>
-            <w:tcMar>
-              <w:top w:w="100" w:type="dxa"/>
-              <w:bottom w:w="100" w:type="dxa"/>
-              <w:left w:w="120" w:type="dxa"/>
-              <w:right w:w="120" w:type="dxa"/>
-            </w:tcMar>
-            <w:tcBorders>
-              <w:top w:val="none" w:sz="4" w:space="0" w:color="auto"/>
-              <w:left w:val="none" w:sz="4" w:space="0" w:color="auto"/>
-              <w:bottom w:val="single" w:sz="4" w:space="0" w:color="E2E8F0"/>
-              <w:right w:val="none" w:sz="4" w:space="0" w:color="auto"/>
-              <w:insideH w:val="none"/>
-              <w:insideV w:val="none"/>
-            </w:tcBorders>
+            <w:tcW w:type="dxa" w:w="2880"/>
           </w:tcPr>
           <w:p>
             <w:r>
-              <w:rPr>
-                <w:rFonts w:ascii="Calibri" w:hAnsi="Calibri"/>
-                <w:b/>
-                <w:color w:val="0F172A"/>
-                <w:sz w:val="19"/>
-              </w:rPr>
-              <w:t>Self-signed certificate in chain</w:t>
+              <w:t>Self-signed certificate in certificate chain</w:t>
             </w:r>
           </w:p>
         </w:tc>
         <w:tc>
           <w:tcPr>
             <w:tcW w:type="dxa" w:w="2880"/>
-            <w:shd w:fill="FFFFFF"/>
-            <w:tcMar>
-              <w:top w:w="100" w:type="dxa"/>
-              <w:bottom w:w="100" w:type="dxa"/>
-              <w:left w:w="120" w:type="dxa"/>
-              <w:right w:w="120" w:type="dxa"/>
-            </w:tcMar>
-            <w:tcBorders>
-              <w:top w:val="none" w:sz="4" w:space="0" w:color="auto"/>
-              <w:left w:val="none" w:sz="4" w:space="0" w:color="auto"/>
-              <w:bottom w:val="single" w:sz="4" w:space="0" w:color="E2E8F0"/>
-              <w:right w:val="none" w:sz="4" w:space="0" w:color="auto"/>
-              <w:insideH w:val="none"/>
-              <w:insideV w:val="none"/>
-            </w:tcBorders>
           </w:tcPr>
           <w:p>
             <w:r>
-              <w:rPr>
-                <w:rFonts w:ascii="Calibri" w:hAnsi="Calibri"/>
-                <w:color w:val="334155"/>
-                <w:sz w:val="19"/>
-              </w:rPr>
               <w:t>Почтовый сервер использует самоподписанный SSL-сертификат.</w:t>
             </w:r>
           </w:p>
         </w:tc>
         <w:tc>
           <w:tcPr>
-            <w:tcW w:type="dxa" w:w="3888"/>
-            <w:shd w:fill="FFFFFF"/>
-            <w:tcMar>
-              <w:top w:w="100" w:type="dxa"/>
-              <w:bottom w:w="100" w:type="dxa"/>
-              <w:left w:w="120" w:type="dxa"/>
-              <w:right w:w="120" w:type="dxa"/>
-            </w:tcMar>
-            <w:tcBorders>
-              <w:top w:val="none" w:sz="4" w:space="0" w:color="auto"/>
-              <w:left w:val="none" w:sz="4" w:space="0" w:color="auto"/>
-              <w:bottom w:val="single" w:sz="4" w:space="0" w:color="E2E8F0"/>
-              <w:right w:val="none" w:sz="4" w:space="0" w:color="auto"/>
-              <w:insideH w:val="none"/>
-              <w:insideV w:val="none"/>
-            </w:tcBorders>
+            <w:tcW w:type="dxa" w:w="2880"/>
           </w:tcPr>
           <w:p>
             <w:r>
-              <w:rPr>
-                <w:rFonts w:ascii="Calibri" w:hAnsi="Calibri"/>
-                <w:color w:val="334155"/>
-                <w:sz w:val="19"/>
-              </w:rPr>
-              <w:t>Приложение требует валидный TLS-сертификат. Для почты cPanel укажите в качестве HOST прямое имя сервера хостинга (напр. server12.hosting.com).</w:t>
+              <w:t>Приложение требует валидный TLS-сертификат (rejectUnauthorized: true). Если используется корпоративная почта cPanel, убедитесь, что в качестве CONTACT_SMTP_HOST указан хост с установленным Let's Encrypt / cPanel SSL (например, имя сервера хостинга serverXX.hosting.com).</w:t>
             </w:r>
           </w:p>
         </w:tc>
@@ -2423,92 +905,31 @@
       <w:tr>
         <w:tc>
           <w:tcPr>
-            <w:tcW w:type="dxa" w:w="2592"/>
-            <w:shd w:fill="F8FAFC"/>
-            <w:tcMar>
-              <w:top w:w="100" w:type="dxa"/>
-              <w:bottom w:w="100" w:type="dxa"/>
-              <w:left w:w="120" w:type="dxa"/>
-              <w:right w:w="120" w:type="dxa"/>
-            </w:tcMar>
-            <w:tcBorders>
-              <w:top w:val="none" w:sz="4" w:space="0" w:color="auto"/>
-              <w:left w:val="none" w:sz="4" w:space="0" w:color="auto"/>
-              <w:bottom w:val="single" w:sz="4" w:space="0" w:color="E2E8F0"/>
-              <w:right w:val="none" w:sz="4" w:space="0" w:color="auto"/>
-              <w:insideH w:val="none"/>
-              <w:insideV w:val="none"/>
-            </w:tcBorders>
+            <w:tcW w:type="dxa" w:w="2880"/>
           </w:tcPr>
           <w:p>
             <w:r>
-              <w:rPr>
-                <w:rFonts w:ascii="Calibri" w:hAnsi="Calibri"/>
-                <w:b/>
-                <w:color w:val="0F172A"/>
-                <w:sz w:val="19"/>
-              </w:rPr>
-              <w:t>Письма попадают в Спам</w:t>
+              <w:t>Письма попадают в «Спам»</w:t>
             </w:r>
           </w:p>
         </w:tc>
         <w:tc>
           <w:tcPr>
             <w:tcW w:type="dxa" w:w="2880"/>
-            <w:shd w:fill="F8FAFC"/>
-            <w:tcMar>
-              <w:top w:w="100" w:type="dxa"/>
-              <w:bottom w:w="100" w:type="dxa"/>
-              <w:left w:w="120" w:type="dxa"/>
-              <w:right w:w="120" w:type="dxa"/>
-            </w:tcMar>
-            <w:tcBorders>
-              <w:top w:val="none" w:sz="4" w:space="0" w:color="auto"/>
-              <w:left w:val="none" w:sz="4" w:space="0" w:color="auto"/>
-              <w:bottom w:val="single" w:sz="4" w:space="0" w:color="E2E8F0"/>
-              <w:right w:val="none" w:sz="4" w:space="0" w:color="auto"/>
-              <w:insideH w:val="none"/>
-              <w:insideV w:val="none"/>
-            </w:tcBorders>
           </w:tcPr>
           <w:p>
             <w:r>
-              <w:rPr>
-                <w:rFonts w:ascii="Calibri" w:hAnsi="Calibri"/>
-                <w:color w:val="334155"/>
-                <w:sz w:val="19"/>
-              </w:rPr>
-              <w:t>Для домена не прописаны DNS-записи доверия SPF/DKIM.</w:t>
+              <w:t>Отсутствуют или неправильно настроены SPF, DKIM или DMARC.</w:t>
             </w:r>
           </w:p>
         </w:tc>
         <w:tc>
           <w:tcPr>
-            <w:tcW w:type="dxa" w:w="3888"/>
-            <w:shd w:fill="F8FAFC"/>
-            <w:tcMar>
-              <w:top w:w="100" w:type="dxa"/>
-              <w:bottom w:w="100" w:type="dxa"/>
-              <w:left w:w="120" w:type="dxa"/>
-              <w:right w:w="120" w:type="dxa"/>
-            </w:tcMar>
-            <w:tcBorders>
-              <w:top w:val="none" w:sz="4" w:space="0" w:color="auto"/>
-              <w:left w:val="none" w:sz="4" w:space="0" w:color="auto"/>
-              <w:bottom w:val="single" w:sz="4" w:space="0" w:color="E2E8F0"/>
-              <w:right w:val="none" w:sz="4" w:space="0" w:color="auto"/>
-              <w:insideH w:val="none"/>
-              <w:insideV w:val="none"/>
-            </w:tcBorders>
+            <w:tcW w:type="dxa" w:w="2880"/>
           </w:tcPr>
           <w:p>
             <w:r>
-              <w:rPr>
-                <w:rFonts w:ascii="Calibri" w:hAnsi="Calibri"/>
-                <w:color w:val="334155"/>
-                <w:sz w:val="19"/>
-              </w:rPr>
-              <w:t>Добавьте в DNS домена miracon.gr TXT-запись SPF: v=spf1 include:_spf... ~all и DMARC: v=DMARC1; p=none;</w:t>
+              <w:t>Настройте записи для фактического провайдера и домена отправителя по его документации; не копируйте чужой include: или политик DMARC.</w:t>
             </w:r>
           </w:p>
         </w:tc>
@@ -2516,92 +937,63 @@
       <w:tr>
         <w:tc>
           <w:tcPr>
-            <w:tcW w:type="dxa" w:w="2592"/>
-            <w:shd w:fill="FFFFFF"/>
-            <w:tcMar>
-              <w:top w:w="100" w:type="dxa"/>
-              <w:bottom w:w="100" w:type="dxa"/>
-              <w:left w:w="120" w:type="dxa"/>
-              <w:right w:w="120" w:type="dxa"/>
-            </w:tcMar>
-            <w:tcBorders>
-              <w:top w:val="none" w:sz="4" w:space="0" w:color="auto"/>
-              <w:left w:val="none" w:sz="4" w:space="0" w:color="auto"/>
-              <w:bottom w:val="single" w:sz="4" w:space="0" w:color="E2E8F0"/>
-              <w:right w:val="none" w:sz="4" w:space="0" w:color="auto"/>
-              <w:insideH w:val="none"/>
-              <w:insideV w:val="none"/>
-            </w:tcBorders>
+            <w:tcW w:type="dxa" w:w="2880"/>
           </w:tcPr>
           <w:p>
             <w:r>
-              <w:rPr>
-                <w:rFonts w:ascii="Calibri" w:hAnsi="Calibri"/>
-                <w:b/>
-                <w:color w:val="0F172A"/>
-                <w:sz w:val="19"/>
-              </w:rPr>
-              <w:t>Форма возвращает ошибку при отправке</w:t>
+              <w:t>Форма выдаёт ошибку при отправке</w:t>
             </w:r>
           </w:p>
         </w:tc>
         <w:tc>
           <w:tcPr>
             <w:tcW w:type="dxa" w:w="2880"/>
-            <w:shd w:fill="FFFFFF"/>
-            <w:tcMar>
-              <w:top w:w="100" w:type="dxa"/>
-              <w:bottom w:w="100" w:type="dxa"/>
-              <w:left w:w="120" w:type="dxa"/>
-              <w:right w:w="120" w:type="dxa"/>
-            </w:tcMar>
-            <w:tcBorders>
-              <w:top w:val="none" w:sz="4" w:space="0" w:color="auto"/>
-              <w:left w:val="none" w:sz="4" w:space="0" w:color="auto"/>
-              <w:bottom w:val="single" w:sz="4" w:space="0" w:color="E2E8F0"/>
-              <w:right w:val="none" w:sz="4" w:space="0" w:color="auto"/>
-              <w:insideH w:val="none"/>
-              <w:insideV w:val="none"/>
-            </w:tcBorders>
           </w:tcPr>
           <w:p>
             <w:r>
-              <w:rPr>
-                <w:rFonts w:ascii="Calibri" w:hAnsi="Calibri"/>
-                <w:color w:val="334155"/>
-                <w:sz w:val="19"/>
-              </w:rPr>
-              <w:t>CONTACT_DIGEST_SECRET короче 32 символов или пуст.</w:t>
+              <w:t>Отсутствует CONTACT_DIGEST_SECRET или его длина менее 32 символов.</w:t>
             </w:r>
           </w:p>
         </w:tc>
         <w:tc>
           <w:tcPr>
-            <w:tcW w:type="dxa" w:w="3888"/>
-            <w:shd w:fill="FFFFFF"/>
-            <w:tcMar>
-              <w:top w:w="100" w:type="dxa"/>
-              <w:bottom w:w="100" w:type="dxa"/>
-              <w:left w:w="120" w:type="dxa"/>
-              <w:right w:w="120" w:type="dxa"/>
-            </w:tcMar>
-            <w:tcBorders>
-              <w:top w:val="none" w:sz="4" w:space="0" w:color="auto"/>
-              <w:left w:val="none" w:sz="4" w:space="0" w:color="auto"/>
-              <w:bottom w:val="single" w:sz="4" w:space="0" w:color="E2E8F0"/>
-              <w:right w:val="none" w:sz="4" w:space="0" w:color="auto"/>
-              <w:insideH w:val="none"/>
-              <w:insideV w:val="none"/>
-            </w:tcBorders>
+            <w:tcW w:type="dxa" w:w="2880"/>
           </w:tcPr>
           <w:p>
             <w:r>
-              <w:rPr>
-                <w:rFonts w:ascii="Calibri" w:hAnsi="Calibri"/>
-                <w:color w:val="334155"/>
-                <w:sz w:val="19"/>
-              </w:rPr>
-              <w:t>Укажите в CONTACT_DIGEST_SECRET случайную строку длиной от 32 до 64 символов.</w:t>
+              <w:t>Задайте случайный серверный секрет вне публичного каталога и перезапустите приложение.</w:t>
+            </w:r>
+          </w:p>
+        </w:tc>
+      </w:tr>
+      <w:tr>
+        <w:tc>
+          <w:tcPr>
+            <w:tcW w:type="dxa" w:w="2880"/>
+          </w:tcPr>
+          <w:p>
+            <w:r>
+              <w:t>Заявка сохранена, письма нет</w:t>
+            </w:r>
+          </w:p>
+        </w:tc>
+        <w:tc>
+          <w:tcPr>
+            <w:tcW w:type="dxa" w:w="2880"/>
+          </w:tcPr>
+          <w:p>
+            <w:r>
+              <w:t>Worker не запущен, неверное SMTP-окружение Cron или задания в состоянии dead.</w:t>
+            </w:r>
+          </w:p>
+        </w:tc>
+        <w:tc>
+          <w:tcPr>
+            <w:tcW w:type="dxa" w:w="2880"/>
+          </w:tcPr>
+          <w:p>
+            <w:r>
+              <w:t>Проверьте сухой прогон npm run contact:mail:drain, защищённую конфигурацию Cron, закрытый лог и состояния очереди.</w:t>
             </w:r>
           </w:p>
         </w:tc>
@@ -2609,7 +1001,7 @@
     </w:tbl>
     <w:sectPr>
       <w:pgSz w:w="12240" w:h="15840"/>
-      <w:pgMar w:top="1152" w:right="1224" w:bottom="1152" w:left="1224" w:header="720" w:footer="720" w:gutter="0"/>
+      <w:pgMar w:top="1440" w:right="1800" w:bottom="1440" w:left="1800" w:header="720" w:footer="720" w:gutter="0"/>
       <w:cols w:space="720"/>
       <w:docGrid w:linePitch="360"/>
     </w:sectPr>
@@ -2980,13 +1372,9 @@
     <w:name w:val="Normal"/>
     <w:qFormat/>
     <w:rsid w:val="00FC693F"/>
-    <w:pPr>
-      <w:spacing w:line="283" w:lineRule="auto" w:after="80"/>
-    </w:pPr>
     <w:rPr>
-      <w:rFonts w:ascii="Calibri" w:hAnsi="Calibri"/>
-      <w:color w:val="334155"/>
-      <w:sz w:val="22"/>
+      <w:rFonts w:ascii="Arial" w:hAnsi="Arial"/>
+      <w:sz w:val="20"/>
     </w:rPr>
   </w:style>
   <w:style w:type="paragraph" w:styleId="Header">
@@ -3048,10 +1436,10 @@
       <w:outlineLvl w:val="0"/>
     </w:pPr>
     <w:rPr>
-      <w:rFonts w:asciiTheme="majorHAnsi" w:eastAsiaTheme="majorEastAsia" w:hAnsiTheme="majorHAnsi" w:cstheme="majorBidi" w:ascii="Calibri" w:hAnsi="Calibri"/>
+      <w:rFonts w:asciiTheme="majorHAnsi" w:eastAsiaTheme="majorEastAsia" w:hAnsiTheme="majorHAnsi" w:cstheme="majorBidi"/>
       <w:b/>
       <w:bCs/>
-      <w:color w:val="1E293B"/>
+      <w:color w:val="365F91" w:themeColor="accent1" w:themeShade="BF"/>
       <w:sz w:val="28"/>
       <w:szCs w:val="28"/>
     </w:rPr>

</xml_diff>